<commit_message>
Rerun modules and update manuscript
</commit_message>
<xml_diff>
--- a/_extensions/wjschne/apaquarto/apaquarto.docx
+++ b/_extensions/wjschne/apaquarto/apaquarto.docx
@@ -1,6 +1,6 @@
 
 <file path=word/document.xml><?xml version="1.0" encoding="utf-8"?>
-<w:document xmlns:wpc="http://schemas.microsoft.com/office/word/2010/wordprocessingCanvas" xmlns:cx="http://schemas.microsoft.com/office/drawing/2014/chartex" xmlns:cx1="http://schemas.microsoft.com/office/drawing/2015/9/8/chartex" xmlns:cx2="http://schemas.microsoft.com/office/drawing/2015/10/21/chartex" xmlns:cx3="http://schemas.microsoft.com/office/drawing/2016/5/9/chartex" xmlns:cx4="http://schemas.microsoft.com/office/drawing/2016/5/10/chartex" xmlns:cx5="http://schemas.microsoft.com/office/drawing/2016/5/11/chartex" xmlns:cx6="http://schemas.microsoft.com/office/drawing/2016/5/12/chartex" xmlns:cx7="http://schemas.microsoft.com/office/drawing/2016/5/13/chartex" xmlns:cx8="http://schemas.microsoft.com/office/drawing/2016/5/14/chartex" xmlns:mc="http://schemas.openxmlformats.org/markup-compatibility/2006" xmlns:aink="http://schemas.microsoft.com/office/drawing/2016/ink" xmlns:am3d="http://schemas.microsoft.com/office/drawing/2017/model3d" xmlns:o="urn:schemas-microsoft-com:office:office" xmlns:oel="http://schemas.microsoft.com/office/2019/extlst" xmlns:r="http://schemas.openxmlformats.org/officeDocument/2006/relationships" xmlns:m="http://schemas.openxmlformats.org/officeDocument/2006/math" xmlns:v="urn:schemas-microsoft-com:vml" xmlns:wp14="http://schemas.microsoft.com/office/word/2010/wordprocessingDrawing" xmlns:wp="http://schemas.openxmlformats.org/drawingml/2006/wordprocessingDrawing" xmlns:w10="urn:schemas-microsoft-com:office:word" xmlns:w="http://schemas.openxmlformats.org/wordprocessingml/2006/main" xmlns:w14="http://schemas.microsoft.com/office/word/2010/wordml" xmlns:w15="http://schemas.microsoft.com/office/word/2012/wordml" xmlns:w16cex="http://schemas.microsoft.com/office/word/2018/wordml/cex" xmlns:w16cid="http://schemas.microsoft.com/office/word/2016/wordml/cid" xmlns:w16="http://schemas.microsoft.com/office/word/2018/wordml" xmlns:w16du="http://schemas.microsoft.com/office/word/2023/wordml/word16du" xmlns:w16sdtdh="http://schemas.microsoft.com/office/word/2020/wordml/sdtdatahash" xmlns:w16se="http://schemas.microsoft.com/office/word/2015/wordml/symex" xmlns:wpg="http://schemas.microsoft.com/office/word/2010/wordprocessingGroup" xmlns:wpi="http://schemas.microsoft.com/office/word/2010/wordprocessingInk" xmlns:wne="http://schemas.microsoft.com/office/word/2006/wordml" xmlns:wps="http://schemas.microsoft.com/office/word/2010/wordprocessingShape" mc:Ignorable="w14 w15 w16se w16cid w16 w16cex w16sdtdh w16du wp14">
+<w:document xmlns:wpc="http://schemas.microsoft.com/office/word/2010/wordprocessingCanvas" xmlns:cx="http://schemas.microsoft.com/office/drawing/2014/chartex" xmlns:cx1="http://schemas.microsoft.com/office/drawing/2015/9/8/chartex" xmlns:cx2="http://schemas.microsoft.com/office/drawing/2015/10/21/chartex" xmlns:cx3="http://schemas.microsoft.com/office/drawing/2016/5/9/chartex" xmlns:cx4="http://schemas.microsoft.com/office/drawing/2016/5/10/chartex" xmlns:cx5="http://schemas.microsoft.com/office/drawing/2016/5/11/chartex" xmlns:cx6="http://schemas.microsoft.com/office/drawing/2016/5/12/chartex" xmlns:cx7="http://schemas.microsoft.com/office/drawing/2016/5/13/chartex" xmlns:cx8="http://schemas.microsoft.com/office/drawing/2016/5/14/chartex" xmlns:mc="http://schemas.openxmlformats.org/markup-compatibility/2006" xmlns:aink="http://schemas.microsoft.com/office/drawing/2016/ink" xmlns:am3d="http://schemas.microsoft.com/office/drawing/2017/model3d" xmlns:o="urn:schemas-microsoft-com:office:office" xmlns:oel="http://schemas.microsoft.com/office/2019/extlst" xmlns:r="http://schemas.openxmlformats.org/officeDocument/2006/relationships" xmlns:m="http://schemas.openxmlformats.org/officeDocument/2006/math" xmlns:v="urn:schemas-microsoft-com:vml" xmlns:wp14="http://schemas.microsoft.com/office/word/2010/wordprocessingDrawing" xmlns:wp="http://schemas.openxmlformats.org/drawingml/2006/wordprocessingDrawing" xmlns:w10="urn:schemas-microsoft-com:office:word" xmlns:w="http://schemas.openxmlformats.org/wordprocessingml/2006/main" xmlns:w14="http://schemas.microsoft.com/office/word/2010/wordml" xmlns:w15="http://schemas.microsoft.com/office/word/2012/wordml" xmlns:w16cex="http://schemas.microsoft.com/office/word/2018/wordml/cex" xmlns:w16cid="http://schemas.microsoft.com/office/word/2016/wordml/cid" xmlns:w16="http://schemas.microsoft.com/office/word/2018/wordml" xmlns:w16du="http://schemas.microsoft.com/office/word/2023/wordml/word16du" xmlns:w16sdtdh="http://schemas.microsoft.com/office/word/2020/wordml/sdtdatahash" xmlns:w16sdtfl="http://schemas.microsoft.com/office/word/2024/wordml/sdtformatlock" xmlns:w16se="http://schemas.microsoft.com/office/word/2015/wordml/symex" xmlns:wpg="http://schemas.microsoft.com/office/word/2010/wordprocessingGroup" xmlns:wpi="http://schemas.microsoft.com/office/word/2010/wordprocessingInk" xmlns:wne="http://schemas.microsoft.com/office/word/2006/wordml" xmlns:wps="http://schemas.microsoft.com/office/word/2010/wordprocessingShape" mc:Ignorable="w14 w15 w16se w16cid w16 w16cex w16sdtdh w16sdtfl w16du wp14">
   <w:body>
     <w:p>
       <w:pPr>
@@ -23,7 +23,7 @@
 </file>
 
 <file path=word/endnotes.xml><?xml version="1.0" encoding="utf-8"?>
-<w:endnotes xmlns:wpc="http://schemas.microsoft.com/office/word/2010/wordprocessingCanvas" xmlns:cx="http://schemas.microsoft.com/office/drawing/2014/chartex" xmlns:cx1="http://schemas.microsoft.com/office/drawing/2015/9/8/chartex" xmlns:cx2="http://schemas.microsoft.com/office/drawing/2015/10/21/chartex" xmlns:cx3="http://schemas.microsoft.com/office/drawing/2016/5/9/chartex" xmlns:cx4="http://schemas.microsoft.com/office/drawing/2016/5/10/chartex" xmlns:cx5="http://schemas.microsoft.com/office/drawing/2016/5/11/chartex" xmlns:cx6="http://schemas.microsoft.com/office/drawing/2016/5/12/chartex" xmlns:cx7="http://schemas.microsoft.com/office/drawing/2016/5/13/chartex" xmlns:cx8="http://schemas.microsoft.com/office/drawing/2016/5/14/chartex" xmlns:mc="http://schemas.openxmlformats.org/markup-compatibility/2006" xmlns:aink="http://schemas.microsoft.com/office/drawing/2016/ink" xmlns:am3d="http://schemas.microsoft.com/office/drawing/2017/model3d" xmlns:o="urn:schemas-microsoft-com:office:office" xmlns:oel="http://schemas.microsoft.com/office/2019/extlst" xmlns:r="http://schemas.openxmlformats.org/officeDocument/2006/relationships" xmlns:m="http://schemas.openxmlformats.org/officeDocument/2006/math" xmlns:v="urn:schemas-microsoft-com:vml" xmlns:wp14="http://schemas.microsoft.com/office/word/2010/wordprocessingDrawing" xmlns:wp="http://schemas.openxmlformats.org/drawingml/2006/wordprocessingDrawing" xmlns:w10="urn:schemas-microsoft-com:office:word" xmlns:w="http://schemas.openxmlformats.org/wordprocessingml/2006/main" xmlns:w14="http://schemas.microsoft.com/office/word/2010/wordml" xmlns:w15="http://schemas.microsoft.com/office/word/2012/wordml" xmlns:w16cex="http://schemas.microsoft.com/office/word/2018/wordml/cex" xmlns:w16cid="http://schemas.microsoft.com/office/word/2016/wordml/cid" xmlns:w16="http://schemas.microsoft.com/office/word/2018/wordml" xmlns:w16du="http://schemas.microsoft.com/office/word/2023/wordml/word16du" xmlns:w16sdtdh="http://schemas.microsoft.com/office/word/2020/wordml/sdtdatahash" xmlns:w16se="http://schemas.microsoft.com/office/word/2015/wordml/symex" xmlns:wpg="http://schemas.microsoft.com/office/word/2010/wordprocessingGroup" xmlns:wpi="http://schemas.microsoft.com/office/word/2010/wordprocessingInk" xmlns:wne="http://schemas.microsoft.com/office/word/2006/wordml" xmlns:wps="http://schemas.microsoft.com/office/word/2010/wordprocessingShape" mc:Ignorable="w14 w15 w16se w16cid w16 w16cex w16sdtdh w16du wp14">
+<w:endnotes xmlns:wpc="http://schemas.microsoft.com/office/word/2010/wordprocessingCanvas" xmlns:cx="http://schemas.microsoft.com/office/drawing/2014/chartex" xmlns:cx1="http://schemas.microsoft.com/office/drawing/2015/9/8/chartex" xmlns:cx2="http://schemas.microsoft.com/office/drawing/2015/10/21/chartex" xmlns:cx3="http://schemas.microsoft.com/office/drawing/2016/5/9/chartex" xmlns:cx4="http://schemas.microsoft.com/office/drawing/2016/5/10/chartex" xmlns:cx5="http://schemas.microsoft.com/office/drawing/2016/5/11/chartex" xmlns:cx6="http://schemas.microsoft.com/office/drawing/2016/5/12/chartex" xmlns:cx7="http://schemas.microsoft.com/office/drawing/2016/5/13/chartex" xmlns:cx8="http://schemas.microsoft.com/office/drawing/2016/5/14/chartex" xmlns:mc="http://schemas.openxmlformats.org/markup-compatibility/2006" xmlns:aink="http://schemas.microsoft.com/office/drawing/2016/ink" xmlns:am3d="http://schemas.microsoft.com/office/drawing/2017/model3d" xmlns:o="urn:schemas-microsoft-com:office:office" xmlns:oel="http://schemas.microsoft.com/office/2019/extlst" xmlns:r="http://schemas.openxmlformats.org/officeDocument/2006/relationships" xmlns:m="http://schemas.openxmlformats.org/officeDocument/2006/math" xmlns:v="urn:schemas-microsoft-com:vml" xmlns:wp14="http://schemas.microsoft.com/office/word/2010/wordprocessingDrawing" xmlns:wp="http://schemas.openxmlformats.org/drawingml/2006/wordprocessingDrawing" xmlns:w10="urn:schemas-microsoft-com:office:word" xmlns:w="http://schemas.openxmlformats.org/wordprocessingml/2006/main" xmlns:w14="http://schemas.microsoft.com/office/word/2010/wordml" xmlns:w15="http://schemas.microsoft.com/office/word/2012/wordml" xmlns:w16cex="http://schemas.microsoft.com/office/word/2018/wordml/cex" xmlns:w16cid="http://schemas.microsoft.com/office/word/2016/wordml/cid" xmlns:w16="http://schemas.microsoft.com/office/word/2018/wordml" xmlns:w16du="http://schemas.microsoft.com/office/word/2023/wordml/word16du" xmlns:w16sdtdh="http://schemas.microsoft.com/office/word/2020/wordml/sdtdatahash" xmlns:w16sdtfl="http://schemas.microsoft.com/office/word/2024/wordml/sdtformatlock" xmlns:w16se="http://schemas.microsoft.com/office/word/2015/wordml/symex" xmlns:wpg="http://schemas.microsoft.com/office/word/2010/wordprocessingGroup" xmlns:wpi="http://schemas.microsoft.com/office/word/2010/wordprocessingInk" xmlns:wne="http://schemas.microsoft.com/office/word/2006/wordml" xmlns:wps="http://schemas.microsoft.com/office/word/2010/wordprocessingShape" mc:Ignorable="w14 w15 w16se w16cid w16 w16cex w16sdtdh w16sdtfl w16du wp14">
   <w:endnote w:type="separator" w:id="-1">
     <w:p>
       <w:r>
@@ -42,7 +42,7 @@
 </file>
 
 <file path=word/footer1.xml><?xml version="1.0" encoding="utf-8"?>
-<w:ftr xmlns:wpc="http://schemas.microsoft.com/office/word/2010/wordprocessingCanvas" xmlns:cx="http://schemas.microsoft.com/office/drawing/2014/chartex" xmlns:cx1="http://schemas.microsoft.com/office/drawing/2015/9/8/chartex" xmlns:cx2="http://schemas.microsoft.com/office/drawing/2015/10/21/chartex" xmlns:cx3="http://schemas.microsoft.com/office/drawing/2016/5/9/chartex" xmlns:cx4="http://schemas.microsoft.com/office/drawing/2016/5/10/chartex" xmlns:cx5="http://schemas.microsoft.com/office/drawing/2016/5/11/chartex" xmlns:cx6="http://schemas.microsoft.com/office/drawing/2016/5/12/chartex" xmlns:cx7="http://schemas.microsoft.com/office/drawing/2016/5/13/chartex" xmlns:cx8="http://schemas.microsoft.com/office/drawing/2016/5/14/chartex" xmlns:mc="http://schemas.openxmlformats.org/markup-compatibility/2006" xmlns:aink="http://schemas.microsoft.com/office/drawing/2016/ink" xmlns:am3d="http://schemas.microsoft.com/office/drawing/2017/model3d" xmlns:o="urn:schemas-microsoft-com:office:office" xmlns:oel="http://schemas.microsoft.com/office/2019/extlst" xmlns:r="http://schemas.openxmlformats.org/officeDocument/2006/relationships" xmlns:m="http://schemas.openxmlformats.org/officeDocument/2006/math" xmlns:v="urn:schemas-microsoft-com:vml" xmlns:wp14="http://schemas.microsoft.com/office/word/2010/wordprocessingDrawing" xmlns:wp="http://schemas.openxmlformats.org/drawingml/2006/wordprocessingDrawing" xmlns:w10="urn:schemas-microsoft-com:office:word" xmlns:w="http://schemas.openxmlformats.org/wordprocessingml/2006/main" xmlns:w14="http://schemas.microsoft.com/office/word/2010/wordml" xmlns:w15="http://schemas.microsoft.com/office/word/2012/wordml" xmlns:w16cex="http://schemas.microsoft.com/office/word/2018/wordml/cex" xmlns:w16cid="http://schemas.microsoft.com/office/word/2016/wordml/cid" xmlns:w16="http://schemas.microsoft.com/office/word/2018/wordml" xmlns:w16du="http://schemas.microsoft.com/office/word/2023/wordml/word16du" xmlns:w16sdtdh="http://schemas.microsoft.com/office/word/2020/wordml/sdtdatahash" xmlns:w16se="http://schemas.microsoft.com/office/word/2015/wordml/symex" xmlns:wpg="http://schemas.microsoft.com/office/word/2010/wordprocessingGroup" xmlns:wpi="http://schemas.microsoft.com/office/word/2010/wordprocessingInk" xmlns:wne="http://schemas.microsoft.com/office/word/2006/wordml" xmlns:wps="http://schemas.microsoft.com/office/word/2010/wordprocessingShape" mc:Ignorable="w14 w15 w16se w16cid w16 w16cex w16sdtdh w16du wp14">
+<w:ftr xmlns:wpc="http://schemas.microsoft.com/office/word/2010/wordprocessingCanvas" xmlns:cx="http://schemas.microsoft.com/office/drawing/2014/chartex" xmlns:cx1="http://schemas.microsoft.com/office/drawing/2015/9/8/chartex" xmlns:cx2="http://schemas.microsoft.com/office/drawing/2015/10/21/chartex" xmlns:cx3="http://schemas.microsoft.com/office/drawing/2016/5/9/chartex" xmlns:cx4="http://schemas.microsoft.com/office/drawing/2016/5/10/chartex" xmlns:cx5="http://schemas.microsoft.com/office/drawing/2016/5/11/chartex" xmlns:cx6="http://schemas.microsoft.com/office/drawing/2016/5/12/chartex" xmlns:cx7="http://schemas.microsoft.com/office/drawing/2016/5/13/chartex" xmlns:cx8="http://schemas.microsoft.com/office/drawing/2016/5/14/chartex" xmlns:mc="http://schemas.openxmlformats.org/markup-compatibility/2006" xmlns:aink="http://schemas.microsoft.com/office/drawing/2016/ink" xmlns:am3d="http://schemas.microsoft.com/office/drawing/2017/model3d" xmlns:o="urn:schemas-microsoft-com:office:office" xmlns:oel="http://schemas.microsoft.com/office/2019/extlst" xmlns:r="http://schemas.openxmlformats.org/officeDocument/2006/relationships" xmlns:m="http://schemas.openxmlformats.org/officeDocument/2006/math" xmlns:v="urn:schemas-microsoft-com:vml" xmlns:wp14="http://schemas.microsoft.com/office/word/2010/wordprocessingDrawing" xmlns:wp="http://schemas.openxmlformats.org/drawingml/2006/wordprocessingDrawing" xmlns:w10="urn:schemas-microsoft-com:office:word" xmlns:w="http://schemas.openxmlformats.org/wordprocessingml/2006/main" xmlns:w14="http://schemas.microsoft.com/office/word/2010/wordml" xmlns:w15="http://schemas.microsoft.com/office/word/2012/wordml" xmlns:w16cex="http://schemas.microsoft.com/office/word/2018/wordml/cex" xmlns:w16cid="http://schemas.microsoft.com/office/word/2016/wordml/cid" xmlns:w16="http://schemas.microsoft.com/office/word/2018/wordml" xmlns:w16du="http://schemas.microsoft.com/office/word/2023/wordml/word16du" xmlns:w16sdtdh="http://schemas.microsoft.com/office/word/2020/wordml/sdtdatahash" xmlns:w16sdtfl="http://schemas.microsoft.com/office/word/2024/wordml/sdtformatlock" xmlns:w16se="http://schemas.microsoft.com/office/word/2015/wordml/symex" xmlns:wpg="http://schemas.microsoft.com/office/word/2010/wordprocessingGroup" xmlns:wpi="http://schemas.microsoft.com/office/word/2010/wordprocessingInk" xmlns:wne="http://schemas.microsoft.com/office/word/2006/wordml" xmlns:wps="http://schemas.microsoft.com/office/word/2010/wordprocessingShape" mc:Ignorable="w14 w15 w16se w16cid w16 w16cex w16sdtdh w16sdtfl w16du wp14">
   <w:p>
     <w:pPr>
       <w:pStyle w:val="Footer"/>
@@ -52,7 +52,7 @@
 </file>
 
 <file path=word/footer2.xml><?xml version="1.0" encoding="utf-8"?>
-<w:ftr xmlns:wpc="http://schemas.microsoft.com/office/word/2010/wordprocessingCanvas" xmlns:cx="http://schemas.microsoft.com/office/drawing/2014/chartex" xmlns:cx1="http://schemas.microsoft.com/office/drawing/2015/9/8/chartex" xmlns:cx2="http://schemas.microsoft.com/office/drawing/2015/10/21/chartex" xmlns:cx3="http://schemas.microsoft.com/office/drawing/2016/5/9/chartex" xmlns:cx4="http://schemas.microsoft.com/office/drawing/2016/5/10/chartex" xmlns:cx5="http://schemas.microsoft.com/office/drawing/2016/5/11/chartex" xmlns:cx6="http://schemas.microsoft.com/office/drawing/2016/5/12/chartex" xmlns:cx7="http://schemas.microsoft.com/office/drawing/2016/5/13/chartex" xmlns:cx8="http://schemas.microsoft.com/office/drawing/2016/5/14/chartex" xmlns:mc="http://schemas.openxmlformats.org/markup-compatibility/2006" xmlns:aink="http://schemas.microsoft.com/office/drawing/2016/ink" xmlns:am3d="http://schemas.microsoft.com/office/drawing/2017/model3d" xmlns:o="urn:schemas-microsoft-com:office:office" xmlns:oel="http://schemas.microsoft.com/office/2019/extlst" xmlns:r="http://schemas.openxmlformats.org/officeDocument/2006/relationships" xmlns:m="http://schemas.openxmlformats.org/officeDocument/2006/math" xmlns:v="urn:schemas-microsoft-com:vml" xmlns:wp14="http://schemas.microsoft.com/office/word/2010/wordprocessingDrawing" xmlns:wp="http://schemas.openxmlformats.org/drawingml/2006/wordprocessingDrawing" xmlns:w10="urn:schemas-microsoft-com:office:word" xmlns:w="http://schemas.openxmlformats.org/wordprocessingml/2006/main" xmlns:w14="http://schemas.microsoft.com/office/word/2010/wordml" xmlns:w15="http://schemas.microsoft.com/office/word/2012/wordml" xmlns:w16cex="http://schemas.microsoft.com/office/word/2018/wordml/cex" xmlns:w16cid="http://schemas.microsoft.com/office/word/2016/wordml/cid" xmlns:w16="http://schemas.microsoft.com/office/word/2018/wordml" xmlns:w16du="http://schemas.microsoft.com/office/word/2023/wordml/word16du" xmlns:w16sdtdh="http://schemas.microsoft.com/office/word/2020/wordml/sdtdatahash" xmlns:w16se="http://schemas.microsoft.com/office/word/2015/wordml/symex" xmlns:wpg="http://schemas.microsoft.com/office/word/2010/wordprocessingGroup" xmlns:wpi="http://schemas.microsoft.com/office/word/2010/wordprocessingInk" xmlns:wne="http://schemas.microsoft.com/office/word/2006/wordml" xmlns:wps="http://schemas.microsoft.com/office/word/2010/wordprocessingShape" mc:Ignorable="w14 w15 w16se w16cid w16 w16cex w16sdtdh w16du wp14">
+<w:ftr xmlns:wpc="http://schemas.microsoft.com/office/word/2010/wordprocessingCanvas" xmlns:cx="http://schemas.microsoft.com/office/drawing/2014/chartex" xmlns:cx1="http://schemas.microsoft.com/office/drawing/2015/9/8/chartex" xmlns:cx2="http://schemas.microsoft.com/office/drawing/2015/10/21/chartex" xmlns:cx3="http://schemas.microsoft.com/office/drawing/2016/5/9/chartex" xmlns:cx4="http://schemas.microsoft.com/office/drawing/2016/5/10/chartex" xmlns:cx5="http://schemas.microsoft.com/office/drawing/2016/5/11/chartex" xmlns:cx6="http://schemas.microsoft.com/office/drawing/2016/5/12/chartex" xmlns:cx7="http://schemas.microsoft.com/office/drawing/2016/5/13/chartex" xmlns:cx8="http://schemas.microsoft.com/office/drawing/2016/5/14/chartex" xmlns:mc="http://schemas.openxmlformats.org/markup-compatibility/2006" xmlns:aink="http://schemas.microsoft.com/office/drawing/2016/ink" xmlns:am3d="http://schemas.microsoft.com/office/drawing/2017/model3d" xmlns:o="urn:schemas-microsoft-com:office:office" xmlns:oel="http://schemas.microsoft.com/office/2019/extlst" xmlns:r="http://schemas.openxmlformats.org/officeDocument/2006/relationships" xmlns:m="http://schemas.openxmlformats.org/officeDocument/2006/math" xmlns:v="urn:schemas-microsoft-com:vml" xmlns:wp14="http://schemas.microsoft.com/office/word/2010/wordprocessingDrawing" xmlns:wp="http://schemas.openxmlformats.org/drawingml/2006/wordprocessingDrawing" xmlns:w10="urn:schemas-microsoft-com:office:word" xmlns:w="http://schemas.openxmlformats.org/wordprocessingml/2006/main" xmlns:w14="http://schemas.microsoft.com/office/word/2010/wordml" xmlns:w15="http://schemas.microsoft.com/office/word/2012/wordml" xmlns:w16cex="http://schemas.microsoft.com/office/word/2018/wordml/cex" xmlns:w16cid="http://schemas.microsoft.com/office/word/2016/wordml/cid" xmlns:w16="http://schemas.microsoft.com/office/word/2018/wordml" xmlns:w16du="http://schemas.microsoft.com/office/word/2023/wordml/word16du" xmlns:w16sdtdh="http://schemas.microsoft.com/office/word/2020/wordml/sdtdatahash" xmlns:w16sdtfl="http://schemas.microsoft.com/office/word/2024/wordml/sdtformatlock" xmlns:w16se="http://schemas.microsoft.com/office/word/2015/wordml/symex" xmlns:wpg="http://schemas.microsoft.com/office/word/2010/wordprocessingGroup" xmlns:wpi="http://schemas.microsoft.com/office/word/2010/wordprocessingInk" xmlns:wne="http://schemas.microsoft.com/office/word/2006/wordml" xmlns:wps="http://schemas.microsoft.com/office/word/2010/wordprocessingShape" mc:Ignorable="w14 w15 w16se w16cid w16 w16cex w16sdtdh w16sdtfl w16du wp14">
   <w:p>
     <w:pPr>
       <w:pStyle w:val="Footer"/>
@@ -62,7 +62,7 @@
 </file>
 
 <file path=word/footer3.xml><?xml version="1.0" encoding="utf-8"?>
-<w:ftr xmlns:wpc="http://schemas.microsoft.com/office/word/2010/wordprocessingCanvas" xmlns:cx="http://schemas.microsoft.com/office/drawing/2014/chartex" xmlns:cx1="http://schemas.microsoft.com/office/drawing/2015/9/8/chartex" xmlns:cx2="http://schemas.microsoft.com/office/drawing/2015/10/21/chartex" xmlns:cx3="http://schemas.microsoft.com/office/drawing/2016/5/9/chartex" xmlns:cx4="http://schemas.microsoft.com/office/drawing/2016/5/10/chartex" xmlns:cx5="http://schemas.microsoft.com/office/drawing/2016/5/11/chartex" xmlns:cx6="http://schemas.microsoft.com/office/drawing/2016/5/12/chartex" xmlns:cx7="http://schemas.microsoft.com/office/drawing/2016/5/13/chartex" xmlns:cx8="http://schemas.microsoft.com/office/drawing/2016/5/14/chartex" xmlns:mc="http://schemas.openxmlformats.org/markup-compatibility/2006" xmlns:aink="http://schemas.microsoft.com/office/drawing/2016/ink" xmlns:am3d="http://schemas.microsoft.com/office/drawing/2017/model3d" xmlns:o="urn:schemas-microsoft-com:office:office" xmlns:oel="http://schemas.microsoft.com/office/2019/extlst" xmlns:r="http://schemas.openxmlformats.org/officeDocument/2006/relationships" xmlns:m="http://schemas.openxmlformats.org/officeDocument/2006/math" xmlns:v="urn:schemas-microsoft-com:vml" xmlns:wp14="http://schemas.microsoft.com/office/word/2010/wordprocessingDrawing" xmlns:wp="http://schemas.openxmlformats.org/drawingml/2006/wordprocessingDrawing" xmlns:w10="urn:schemas-microsoft-com:office:word" xmlns:w="http://schemas.openxmlformats.org/wordprocessingml/2006/main" xmlns:w14="http://schemas.microsoft.com/office/word/2010/wordml" xmlns:w15="http://schemas.microsoft.com/office/word/2012/wordml" xmlns:w16cex="http://schemas.microsoft.com/office/word/2018/wordml/cex" xmlns:w16cid="http://schemas.microsoft.com/office/word/2016/wordml/cid" xmlns:w16="http://schemas.microsoft.com/office/word/2018/wordml" xmlns:w16du="http://schemas.microsoft.com/office/word/2023/wordml/word16du" xmlns:w16sdtdh="http://schemas.microsoft.com/office/word/2020/wordml/sdtdatahash" xmlns:w16se="http://schemas.microsoft.com/office/word/2015/wordml/symex" xmlns:wpg="http://schemas.microsoft.com/office/word/2010/wordprocessingGroup" xmlns:wpi="http://schemas.microsoft.com/office/word/2010/wordprocessingInk" xmlns:wne="http://schemas.microsoft.com/office/word/2006/wordml" xmlns:wps="http://schemas.microsoft.com/office/word/2010/wordprocessingShape" mc:Ignorable="w14 w15 w16se w16cid w16 w16cex w16sdtdh w16du wp14">
+<w:ftr xmlns:wpc="http://schemas.microsoft.com/office/word/2010/wordprocessingCanvas" xmlns:cx="http://schemas.microsoft.com/office/drawing/2014/chartex" xmlns:cx1="http://schemas.microsoft.com/office/drawing/2015/9/8/chartex" xmlns:cx2="http://schemas.microsoft.com/office/drawing/2015/10/21/chartex" xmlns:cx3="http://schemas.microsoft.com/office/drawing/2016/5/9/chartex" xmlns:cx4="http://schemas.microsoft.com/office/drawing/2016/5/10/chartex" xmlns:cx5="http://schemas.microsoft.com/office/drawing/2016/5/11/chartex" xmlns:cx6="http://schemas.microsoft.com/office/drawing/2016/5/12/chartex" xmlns:cx7="http://schemas.microsoft.com/office/drawing/2016/5/13/chartex" xmlns:cx8="http://schemas.microsoft.com/office/drawing/2016/5/14/chartex" xmlns:mc="http://schemas.openxmlformats.org/markup-compatibility/2006" xmlns:aink="http://schemas.microsoft.com/office/drawing/2016/ink" xmlns:am3d="http://schemas.microsoft.com/office/drawing/2017/model3d" xmlns:o="urn:schemas-microsoft-com:office:office" xmlns:oel="http://schemas.microsoft.com/office/2019/extlst" xmlns:r="http://schemas.openxmlformats.org/officeDocument/2006/relationships" xmlns:m="http://schemas.openxmlformats.org/officeDocument/2006/math" xmlns:v="urn:schemas-microsoft-com:vml" xmlns:wp14="http://schemas.microsoft.com/office/word/2010/wordprocessingDrawing" xmlns:wp="http://schemas.openxmlformats.org/drawingml/2006/wordprocessingDrawing" xmlns:w10="urn:schemas-microsoft-com:office:word" xmlns:w="http://schemas.openxmlformats.org/wordprocessingml/2006/main" xmlns:w14="http://schemas.microsoft.com/office/word/2010/wordml" xmlns:w15="http://schemas.microsoft.com/office/word/2012/wordml" xmlns:w16cex="http://schemas.microsoft.com/office/word/2018/wordml/cex" xmlns:w16cid="http://schemas.microsoft.com/office/word/2016/wordml/cid" xmlns:w16="http://schemas.microsoft.com/office/word/2018/wordml" xmlns:w16du="http://schemas.microsoft.com/office/word/2023/wordml/word16du" xmlns:w16sdtdh="http://schemas.microsoft.com/office/word/2020/wordml/sdtdatahash" xmlns:w16sdtfl="http://schemas.microsoft.com/office/word/2024/wordml/sdtformatlock" xmlns:w16se="http://schemas.microsoft.com/office/word/2015/wordml/symex" xmlns:wpg="http://schemas.microsoft.com/office/word/2010/wordprocessingGroup" xmlns:wpi="http://schemas.microsoft.com/office/word/2010/wordprocessingInk" xmlns:wne="http://schemas.microsoft.com/office/word/2006/wordml" xmlns:wps="http://schemas.microsoft.com/office/word/2010/wordprocessingShape" mc:Ignorable="w14 w15 w16se w16cid w16 w16cex w16sdtdh w16sdtfl w16du wp14">
   <w:p>
     <w:pPr>
       <w:pStyle w:val="Footer"/>
@@ -72,7 +72,7 @@
 </file>
 
 <file path=word/footnotes.xml><?xml version="1.0" encoding="utf-8"?>
-<w:footnotes xmlns:wpc="http://schemas.microsoft.com/office/word/2010/wordprocessingCanvas" xmlns:cx="http://schemas.microsoft.com/office/drawing/2014/chartex" xmlns:cx1="http://schemas.microsoft.com/office/drawing/2015/9/8/chartex" xmlns:cx2="http://schemas.microsoft.com/office/drawing/2015/10/21/chartex" xmlns:cx3="http://schemas.microsoft.com/office/drawing/2016/5/9/chartex" xmlns:cx4="http://schemas.microsoft.com/office/drawing/2016/5/10/chartex" xmlns:cx5="http://schemas.microsoft.com/office/drawing/2016/5/11/chartex" xmlns:cx6="http://schemas.microsoft.com/office/drawing/2016/5/12/chartex" xmlns:cx7="http://schemas.microsoft.com/office/drawing/2016/5/13/chartex" xmlns:cx8="http://schemas.microsoft.com/office/drawing/2016/5/14/chartex" xmlns:mc="http://schemas.openxmlformats.org/markup-compatibility/2006" xmlns:aink="http://schemas.microsoft.com/office/drawing/2016/ink" xmlns:am3d="http://schemas.microsoft.com/office/drawing/2017/model3d" xmlns:o="urn:schemas-microsoft-com:office:office" xmlns:oel="http://schemas.microsoft.com/office/2019/extlst" xmlns:r="http://schemas.openxmlformats.org/officeDocument/2006/relationships" xmlns:m="http://schemas.openxmlformats.org/officeDocument/2006/math" xmlns:v="urn:schemas-microsoft-com:vml" xmlns:wp14="http://schemas.microsoft.com/office/word/2010/wordprocessingDrawing" xmlns:wp="http://schemas.openxmlformats.org/drawingml/2006/wordprocessingDrawing" xmlns:w10="urn:schemas-microsoft-com:office:word" xmlns:w="http://schemas.openxmlformats.org/wordprocessingml/2006/main" xmlns:w14="http://schemas.microsoft.com/office/word/2010/wordml" xmlns:w15="http://schemas.microsoft.com/office/word/2012/wordml" xmlns:w16cex="http://schemas.microsoft.com/office/word/2018/wordml/cex" xmlns:w16cid="http://schemas.microsoft.com/office/word/2016/wordml/cid" xmlns:w16="http://schemas.microsoft.com/office/word/2018/wordml" xmlns:w16du="http://schemas.microsoft.com/office/word/2023/wordml/word16du" xmlns:w16sdtdh="http://schemas.microsoft.com/office/word/2020/wordml/sdtdatahash" xmlns:w16se="http://schemas.microsoft.com/office/word/2015/wordml/symex" xmlns:wpg="http://schemas.microsoft.com/office/word/2010/wordprocessingGroup" xmlns:wpi="http://schemas.microsoft.com/office/word/2010/wordprocessingInk" xmlns:wne="http://schemas.microsoft.com/office/word/2006/wordml" xmlns:wps="http://schemas.microsoft.com/office/word/2010/wordprocessingShape" mc:Ignorable="w14 w15 w16se w16cid w16 w16cex w16sdtdh w16du wp14">
+<w:footnotes xmlns:wpc="http://schemas.microsoft.com/office/word/2010/wordprocessingCanvas" xmlns:cx="http://schemas.microsoft.com/office/drawing/2014/chartex" xmlns:cx1="http://schemas.microsoft.com/office/drawing/2015/9/8/chartex" xmlns:cx2="http://schemas.microsoft.com/office/drawing/2015/10/21/chartex" xmlns:cx3="http://schemas.microsoft.com/office/drawing/2016/5/9/chartex" xmlns:cx4="http://schemas.microsoft.com/office/drawing/2016/5/10/chartex" xmlns:cx5="http://schemas.microsoft.com/office/drawing/2016/5/11/chartex" xmlns:cx6="http://schemas.microsoft.com/office/drawing/2016/5/12/chartex" xmlns:cx7="http://schemas.microsoft.com/office/drawing/2016/5/13/chartex" xmlns:cx8="http://schemas.microsoft.com/office/drawing/2016/5/14/chartex" xmlns:mc="http://schemas.openxmlformats.org/markup-compatibility/2006" xmlns:aink="http://schemas.microsoft.com/office/drawing/2016/ink" xmlns:am3d="http://schemas.microsoft.com/office/drawing/2017/model3d" xmlns:o="urn:schemas-microsoft-com:office:office" xmlns:oel="http://schemas.microsoft.com/office/2019/extlst" xmlns:r="http://schemas.openxmlformats.org/officeDocument/2006/relationships" xmlns:m="http://schemas.openxmlformats.org/officeDocument/2006/math" xmlns:v="urn:schemas-microsoft-com:vml" xmlns:wp14="http://schemas.microsoft.com/office/word/2010/wordprocessingDrawing" xmlns:wp="http://schemas.openxmlformats.org/drawingml/2006/wordprocessingDrawing" xmlns:w10="urn:schemas-microsoft-com:office:word" xmlns:w="http://schemas.openxmlformats.org/wordprocessingml/2006/main" xmlns:w14="http://schemas.microsoft.com/office/word/2010/wordml" xmlns:w15="http://schemas.microsoft.com/office/word/2012/wordml" xmlns:w16cex="http://schemas.microsoft.com/office/word/2018/wordml/cex" xmlns:w16cid="http://schemas.microsoft.com/office/word/2016/wordml/cid" xmlns:w16="http://schemas.microsoft.com/office/word/2018/wordml" xmlns:w16du="http://schemas.microsoft.com/office/word/2023/wordml/word16du" xmlns:w16sdtdh="http://schemas.microsoft.com/office/word/2020/wordml/sdtdatahash" xmlns:w16sdtfl="http://schemas.microsoft.com/office/word/2024/wordml/sdtformatlock" xmlns:w16se="http://schemas.microsoft.com/office/word/2015/wordml/symex" xmlns:wpg="http://schemas.microsoft.com/office/word/2010/wordprocessingGroup" xmlns:wpi="http://schemas.microsoft.com/office/word/2010/wordprocessingInk" xmlns:wne="http://schemas.microsoft.com/office/word/2006/wordml" xmlns:wps="http://schemas.microsoft.com/office/word/2010/wordprocessingShape" mc:Ignorable="w14 w15 w16se w16cid w16 w16cex w16sdtdh w16sdtfl w16du wp14">
   <w:footnote w:type="separator" w:id="-1">
     <w:p>
       <w:r>
@@ -91,7 +91,7 @@
 </file>
 
 <file path=word/header1.xml><?xml version="1.0" encoding="utf-8"?>
-<w:hdr xmlns:wpc="http://schemas.microsoft.com/office/word/2010/wordprocessingCanvas" xmlns:cx="http://schemas.microsoft.com/office/drawing/2014/chartex" xmlns:cx1="http://schemas.microsoft.com/office/drawing/2015/9/8/chartex" xmlns:cx2="http://schemas.microsoft.com/office/drawing/2015/10/21/chartex" xmlns:cx3="http://schemas.microsoft.com/office/drawing/2016/5/9/chartex" xmlns:cx4="http://schemas.microsoft.com/office/drawing/2016/5/10/chartex" xmlns:cx5="http://schemas.microsoft.com/office/drawing/2016/5/11/chartex" xmlns:cx6="http://schemas.microsoft.com/office/drawing/2016/5/12/chartex" xmlns:cx7="http://schemas.microsoft.com/office/drawing/2016/5/13/chartex" xmlns:cx8="http://schemas.microsoft.com/office/drawing/2016/5/14/chartex" xmlns:mc="http://schemas.openxmlformats.org/markup-compatibility/2006" xmlns:aink="http://schemas.microsoft.com/office/drawing/2016/ink" xmlns:am3d="http://schemas.microsoft.com/office/drawing/2017/model3d" xmlns:o="urn:schemas-microsoft-com:office:office" xmlns:oel="http://schemas.microsoft.com/office/2019/extlst" xmlns:r="http://schemas.openxmlformats.org/officeDocument/2006/relationships" xmlns:m="http://schemas.openxmlformats.org/officeDocument/2006/math" xmlns:v="urn:schemas-microsoft-com:vml" xmlns:wp14="http://schemas.microsoft.com/office/word/2010/wordprocessingDrawing" xmlns:wp="http://schemas.openxmlformats.org/drawingml/2006/wordprocessingDrawing" xmlns:w10="urn:schemas-microsoft-com:office:word" xmlns:w="http://schemas.openxmlformats.org/wordprocessingml/2006/main" xmlns:w14="http://schemas.microsoft.com/office/word/2010/wordml" xmlns:w15="http://schemas.microsoft.com/office/word/2012/wordml" xmlns:w16cex="http://schemas.microsoft.com/office/word/2018/wordml/cex" xmlns:w16cid="http://schemas.microsoft.com/office/word/2016/wordml/cid" xmlns:w16="http://schemas.microsoft.com/office/word/2018/wordml" xmlns:w16du="http://schemas.microsoft.com/office/word/2023/wordml/word16du" xmlns:w16sdtdh="http://schemas.microsoft.com/office/word/2020/wordml/sdtdatahash" xmlns:w16se="http://schemas.microsoft.com/office/word/2015/wordml/symex" xmlns:wpg="http://schemas.microsoft.com/office/word/2010/wordprocessingGroup" xmlns:wpi="http://schemas.microsoft.com/office/word/2010/wordprocessingInk" xmlns:wne="http://schemas.microsoft.com/office/word/2006/wordml" xmlns:wps="http://schemas.microsoft.com/office/word/2010/wordprocessingShape" mc:Ignorable="w14 w15 w16se w16cid w16 w16cex w16sdtdh w16du wp14">
+<w:hdr xmlns:wpc="http://schemas.microsoft.com/office/word/2010/wordprocessingCanvas" xmlns:cx="http://schemas.microsoft.com/office/drawing/2014/chartex" xmlns:cx1="http://schemas.microsoft.com/office/drawing/2015/9/8/chartex" xmlns:cx2="http://schemas.microsoft.com/office/drawing/2015/10/21/chartex" xmlns:cx3="http://schemas.microsoft.com/office/drawing/2016/5/9/chartex" xmlns:cx4="http://schemas.microsoft.com/office/drawing/2016/5/10/chartex" xmlns:cx5="http://schemas.microsoft.com/office/drawing/2016/5/11/chartex" xmlns:cx6="http://schemas.microsoft.com/office/drawing/2016/5/12/chartex" xmlns:cx7="http://schemas.microsoft.com/office/drawing/2016/5/13/chartex" xmlns:cx8="http://schemas.microsoft.com/office/drawing/2016/5/14/chartex" xmlns:mc="http://schemas.openxmlformats.org/markup-compatibility/2006" xmlns:aink="http://schemas.microsoft.com/office/drawing/2016/ink" xmlns:am3d="http://schemas.microsoft.com/office/drawing/2017/model3d" xmlns:o="urn:schemas-microsoft-com:office:office" xmlns:oel="http://schemas.microsoft.com/office/2019/extlst" xmlns:r="http://schemas.openxmlformats.org/officeDocument/2006/relationships" xmlns:m="http://schemas.openxmlformats.org/officeDocument/2006/math" xmlns:v="urn:schemas-microsoft-com:vml" xmlns:wp14="http://schemas.microsoft.com/office/word/2010/wordprocessingDrawing" xmlns:wp="http://schemas.openxmlformats.org/drawingml/2006/wordprocessingDrawing" xmlns:w10="urn:schemas-microsoft-com:office:word" xmlns:w="http://schemas.openxmlformats.org/wordprocessingml/2006/main" xmlns:w14="http://schemas.microsoft.com/office/word/2010/wordml" xmlns:w15="http://schemas.microsoft.com/office/word/2012/wordml" xmlns:w16cex="http://schemas.microsoft.com/office/word/2018/wordml/cex" xmlns:w16cid="http://schemas.microsoft.com/office/word/2016/wordml/cid" xmlns:w16="http://schemas.microsoft.com/office/word/2018/wordml" xmlns:w16du="http://schemas.microsoft.com/office/word/2023/wordml/word16du" xmlns:w16sdtdh="http://schemas.microsoft.com/office/word/2020/wordml/sdtdatahash" xmlns:w16sdtfl="http://schemas.microsoft.com/office/word/2024/wordml/sdtformatlock" xmlns:w16se="http://schemas.microsoft.com/office/word/2015/wordml/symex" xmlns:wpg="http://schemas.microsoft.com/office/word/2010/wordprocessingGroup" xmlns:wpi="http://schemas.microsoft.com/office/word/2010/wordprocessingInk" xmlns:wne="http://schemas.microsoft.com/office/word/2006/wordml" xmlns:wps="http://schemas.microsoft.com/office/word/2010/wordprocessingShape" mc:Ignorable="w14 w15 w16se w16cid w16 w16cex w16sdtdh w16sdtfl w16du wp14">
   <w:p>
     <w:pPr>
       <w:pStyle w:val="Header"/>
@@ -101,7 +101,7 @@
 </file>
 
 <file path=word/header2.xml><?xml version="1.0" encoding="utf-8"?>
-<w:hdr xmlns:wpc="http://schemas.microsoft.com/office/word/2010/wordprocessingCanvas" xmlns:cx="http://schemas.microsoft.com/office/drawing/2014/chartex" xmlns:cx1="http://schemas.microsoft.com/office/drawing/2015/9/8/chartex" xmlns:cx2="http://schemas.microsoft.com/office/drawing/2015/10/21/chartex" xmlns:cx3="http://schemas.microsoft.com/office/drawing/2016/5/9/chartex" xmlns:cx4="http://schemas.microsoft.com/office/drawing/2016/5/10/chartex" xmlns:cx5="http://schemas.microsoft.com/office/drawing/2016/5/11/chartex" xmlns:cx6="http://schemas.microsoft.com/office/drawing/2016/5/12/chartex" xmlns:cx7="http://schemas.microsoft.com/office/drawing/2016/5/13/chartex" xmlns:cx8="http://schemas.microsoft.com/office/drawing/2016/5/14/chartex" xmlns:mc="http://schemas.openxmlformats.org/markup-compatibility/2006" xmlns:aink="http://schemas.microsoft.com/office/drawing/2016/ink" xmlns:am3d="http://schemas.microsoft.com/office/drawing/2017/model3d" xmlns:o="urn:schemas-microsoft-com:office:office" xmlns:oel="http://schemas.microsoft.com/office/2019/extlst" xmlns:r="http://schemas.openxmlformats.org/officeDocument/2006/relationships" xmlns:m="http://schemas.openxmlformats.org/officeDocument/2006/math" xmlns:v="urn:schemas-microsoft-com:vml" xmlns:wp14="http://schemas.microsoft.com/office/word/2010/wordprocessingDrawing" xmlns:wp="http://schemas.openxmlformats.org/drawingml/2006/wordprocessingDrawing" xmlns:w10="urn:schemas-microsoft-com:office:word" xmlns:w="http://schemas.openxmlformats.org/wordprocessingml/2006/main" xmlns:w14="http://schemas.microsoft.com/office/word/2010/wordml" xmlns:w15="http://schemas.microsoft.com/office/word/2012/wordml" xmlns:w16cex="http://schemas.microsoft.com/office/word/2018/wordml/cex" xmlns:w16cid="http://schemas.microsoft.com/office/word/2016/wordml/cid" xmlns:w16="http://schemas.microsoft.com/office/word/2018/wordml" xmlns:w16du="http://schemas.microsoft.com/office/word/2023/wordml/word16du" xmlns:w16sdtdh="http://schemas.microsoft.com/office/word/2020/wordml/sdtdatahash" xmlns:w16se="http://schemas.microsoft.com/office/word/2015/wordml/symex" xmlns:wpg="http://schemas.microsoft.com/office/word/2010/wordprocessingGroup" xmlns:wpi="http://schemas.microsoft.com/office/word/2010/wordprocessingInk" xmlns:wne="http://schemas.microsoft.com/office/word/2006/wordml" xmlns:wps="http://schemas.microsoft.com/office/word/2010/wordprocessingShape" mc:Ignorable="w14 w15 w16se w16cid w16 w16cex w16sdtdh w16du wp14">
+<w:hdr xmlns:wpc="http://schemas.microsoft.com/office/word/2010/wordprocessingCanvas" xmlns:cx="http://schemas.microsoft.com/office/drawing/2014/chartex" xmlns:cx1="http://schemas.microsoft.com/office/drawing/2015/9/8/chartex" xmlns:cx2="http://schemas.microsoft.com/office/drawing/2015/10/21/chartex" xmlns:cx3="http://schemas.microsoft.com/office/drawing/2016/5/9/chartex" xmlns:cx4="http://schemas.microsoft.com/office/drawing/2016/5/10/chartex" xmlns:cx5="http://schemas.microsoft.com/office/drawing/2016/5/11/chartex" xmlns:cx6="http://schemas.microsoft.com/office/drawing/2016/5/12/chartex" xmlns:cx7="http://schemas.microsoft.com/office/drawing/2016/5/13/chartex" xmlns:cx8="http://schemas.microsoft.com/office/drawing/2016/5/14/chartex" xmlns:mc="http://schemas.openxmlformats.org/markup-compatibility/2006" xmlns:aink="http://schemas.microsoft.com/office/drawing/2016/ink" xmlns:am3d="http://schemas.microsoft.com/office/drawing/2017/model3d" xmlns:o="urn:schemas-microsoft-com:office:office" xmlns:oel="http://schemas.microsoft.com/office/2019/extlst" xmlns:r="http://schemas.openxmlformats.org/officeDocument/2006/relationships" xmlns:m="http://schemas.openxmlformats.org/officeDocument/2006/math" xmlns:v="urn:schemas-microsoft-com:vml" xmlns:wp14="http://schemas.microsoft.com/office/word/2010/wordprocessingDrawing" xmlns:wp="http://schemas.openxmlformats.org/drawingml/2006/wordprocessingDrawing" xmlns:w10="urn:schemas-microsoft-com:office:word" xmlns:w="http://schemas.openxmlformats.org/wordprocessingml/2006/main" xmlns:w14="http://schemas.microsoft.com/office/word/2010/wordml" xmlns:w15="http://schemas.microsoft.com/office/word/2012/wordml" xmlns:w16cex="http://schemas.microsoft.com/office/word/2018/wordml/cex" xmlns:w16cid="http://schemas.microsoft.com/office/word/2016/wordml/cid" xmlns:w16="http://schemas.microsoft.com/office/word/2018/wordml" xmlns:w16du="http://schemas.microsoft.com/office/word/2023/wordml/word16du" xmlns:w16sdtdh="http://schemas.microsoft.com/office/word/2020/wordml/sdtdatahash" xmlns:w16sdtfl="http://schemas.microsoft.com/office/word/2024/wordml/sdtformatlock" xmlns:w16se="http://schemas.microsoft.com/office/word/2015/wordml/symex" xmlns:wpg="http://schemas.microsoft.com/office/word/2010/wordprocessingGroup" xmlns:wpi="http://schemas.microsoft.com/office/word/2010/wordprocessingInk" xmlns:wne="http://schemas.microsoft.com/office/word/2006/wordml" xmlns:wps="http://schemas.microsoft.com/office/word/2010/wordprocessingShape" mc:Ignorable="w14 w15 w16se w16cid w16 w16cex w16sdtdh w16sdtfl w16du wp14">
   <w:p>
     <w:pPr>
       <w:tabs>
@@ -163,7 +163,7 @@
 </file>
 
 <file path=word/header3.xml><?xml version="1.0" encoding="utf-8"?>
-<w:hdr xmlns:wpc="http://schemas.microsoft.com/office/word/2010/wordprocessingCanvas" xmlns:cx="http://schemas.microsoft.com/office/drawing/2014/chartex" xmlns:cx1="http://schemas.microsoft.com/office/drawing/2015/9/8/chartex" xmlns:cx2="http://schemas.microsoft.com/office/drawing/2015/10/21/chartex" xmlns:cx3="http://schemas.microsoft.com/office/drawing/2016/5/9/chartex" xmlns:cx4="http://schemas.microsoft.com/office/drawing/2016/5/10/chartex" xmlns:cx5="http://schemas.microsoft.com/office/drawing/2016/5/11/chartex" xmlns:cx6="http://schemas.microsoft.com/office/drawing/2016/5/12/chartex" xmlns:cx7="http://schemas.microsoft.com/office/drawing/2016/5/13/chartex" xmlns:cx8="http://schemas.microsoft.com/office/drawing/2016/5/14/chartex" xmlns:mc="http://schemas.openxmlformats.org/markup-compatibility/2006" xmlns:aink="http://schemas.microsoft.com/office/drawing/2016/ink" xmlns:am3d="http://schemas.microsoft.com/office/drawing/2017/model3d" xmlns:o="urn:schemas-microsoft-com:office:office" xmlns:oel="http://schemas.microsoft.com/office/2019/extlst" xmlns:r="http://schemas.openxmlformats.org/officeDocument/2006/relationships" xmlns:m="http://schemas.openxmlformats.org/officeDocument/2006/math" xmlns:v="urn:schemas-microsoft-com:vml" xmlns:wp14="http://schemas.microsoft.com/office/word/2010/wordprocessingDrawing" xmlns:wp="http://schemas.openxmlformats.org/drawingml/2006/wordprocessingDrawing" xmlns:w10="urn:schemas-microsoft-com:office:word" xmlns:w="http://schemas.openxmlformats.org/wordprocessingml/2006/main" xmlns:w14="http://schemas.microsoft.com/office/word/2010/wordml" xmlns:w15="http://schemas.microsoft.com/office/word/2012/wordml" xmlns:w16cex="http://schemas.microsoft.com/office/word/2018/wordml/cex" xmlns:w16cid="http://schemas.microsoft.com/office/word/2016/wordml/cid" xmlns:w16="http://schemas.microsoft.com/office/word/2018/wordml" xmlns:w16du="http://schemas.microsoft.com/office/word/2023/wordml/word16du" xmlns:w16sdtdh="http://schemas.microsoft.com/office/word/2020/wordml/sdtdatahash" xmlns:w16se="http://schemas.microsoft.com/office/word/2015/wordml/symex" xmlns:wpg="http://schemas.microsoft.com/office/word/2010/wordprocessingGroup" xmlns:wpi="http://schemas.microsoft.com/office/word/2010/wordprocessingInk" xmlns:wne="http://schemas.microsoft.com/office/word/2006/wordml" xmlns:wps="http://schemas.microsoft.com/office/word/2010/wordprocessingShape" mc:Ignorable="w14 w15 w16se w16cid w16 w16cex w16sdtdh w16du wp14">
+<w:hdr xmlns:wpc="http://schemas.microsoft.com/office/word/2010/wordprocessingCanvas" xmlns:cx="http://schemas.microsoft.com/office/drawing/2014/chartex" xmlns:cx1="http://schemas.microsoft.com/office/drawing/2015/9/8/chartex" xmlns:cx2="http://schemas.microsoft.com/office/drawing/2015/10/21/chartex" xmlns:cx3="http://schemas.microsoft.com/office/drawing/2016/5/9/chartex" xmlns:cx4="http://schemas.microsoft.com/office/drawing/2016/5/10/chartex" xmlns:cx5="http://schemas.microsoft.com/office/drawing/2016/5/11/chartex" xmlns:cx6="http://schemas.microsoft.com/office/drawing/2016/5/12/chartex" xmlns:cx7="http://schemas.microsoft.com/office/drawing/2016/5/13/chartex" xmlns:cx8="http://schemas.microsoft.com/office/drawing/2016/5/14/chartex" xmlns:mc="http://schemas.openxmlformats.org/markup-compatibility/2006" xmlns:aink="http://schemas.microsoft.com/office/drawing/2016/ink" xmlns:am3d="http://schemas.microsoft.com/office/drawing/2017/model3d" xmlns:o="urn:schemas-microsoft-com:office:office" xmlns:oel="http://schemas.microsoft.com/office/2019/extlst" xmlns:r="http://schemas.openxmlformats.org/officeDocument/2006/relationships" xmlns:m="http://schemas.openxmlformats.org/officeDocument/2006/math" xmlns:v="urn:schemas-microsoft-com:vml" xmlns:wp14="http://schemas.microsoft.com/office/word/2010/wordprocessingDrawing" xmlns:wp="http://schemas.openxmlformats.org/drawingml/2006/wordprocessingDrawing" xmlns:w10="urn:schemas-microsoft-com:office:word" xmlns:w="http://schemas.openxmlformats.org/wordprocessingml/2006/main" xmlns:w14="http://schemas.microsoft.com/office/word/2010/wordml" xmlns:w15="http://schemas.microsoft.com/office/word/2012/wordml" xmlns:w16cex="http://schemas.microsoft.com/office/word/2018/wordml/cex" xmlns:w16cid="http://schemas.microsoft.com/office/word/2016/wordml/cid" xmlns:w16="http://schemas.microsoft.com/office/word/2018/wordml" xmlns:w16du="http://schemas.microsoft.com/office/word/2023/wordml/word16du" xmlns:w16sdtdh="http://schemas.microsoft.com/office/word/2020/wordml/sdtdatahash" xmlns:w16sdtfl="http://schemas.microsoft.com/office/word/2024/wordml/sdtformatlock" xmlns:w16se="http://schemas.microsoft.com/office/word/2015/wordml/symex" xmlns:wpg="http://schemas.microsoft.com/office/word/2010/wordprocessingGroup" xmlns:wpi="http://schemas.microsoft.com/office/word/2010/wordprocessingInk" xmlns:wne="http://schemas.microsoft.com/office/word/2006/wordml" xmlns:wps="http://schemas.microsoft.com/office/word/2010/wordprocessingShape" mc:Ignorable="w14 w15 w16se w16cid w16 w16cex w16sdtdh w16sdtfl w16du wp14">
   <w:p>
     <w:pPr>
       <w:pStyle w:val="Header"/>
@@ -173,7 +173,7 @@
 </file>
 
 <file path=word/numbering.xml><?xml version="1.0" encoding="utf-8"?>
-<w:numbering xmlns:wpc="http://schemas.microsoft.com/office/word/2010/wordprocessingCanvas" xmlns:cx="http://schemas.microsoft.com/office/drawing/2014/chartex" xmlns:cx1="http://schemas.microsoft.com/office/drawing/2015/9/8/chartex" xmlns:cx2="http://schemas.microsoft.com/office/drawing/2015/10/21/chartex" xmlns:cx3="http://schemas.microsoft.com/office/drawing/2016/5/9/chartex" xmlns:cx4="http://schemas.microsoft.com/office/drawing/2016/5/10/chartex" xmlns:cx5="http://schemas.microsoft.com/office/drawing/2016/5/11/chartex" xmlns:cx6="http://schemas.microsoft.com/office/drawing/2016/5/12/chartex" xmlns:cx7="http://schemas.microsoft.com/office/drawing/2016/5/13/chartex" xmlns:cx8="http://schemas.microsoft.com/office/drawing/2016/5/14/chartex" xmlns:mc="http://schemas.openxmlformats.org/markup-compatibility/2006" xmlns:aink="http://schemas.microsoft.com/office/drawing/2016/ink" xmlns:am3d="http://schemas.microsoft.com/office/drawing/2017/model3d" xmlns:o="urn:schemas-microsoft-com:office:office" xmlns:oel="http://schemas.microsoft.com/office/2019/extlst" xmlns:r="http://schemas.openxmlformats.org/officeDocument/2006/relationships" xmlns:m="http://schemas.openxmlformats.org/officeDocument/2006/math" xmlns:v="urn:schemas-microsoft-com:vml" xmlns:wp14="http://schemas.microsoft.com/office/word/2010/wordprocessingDrawing" xmlns:wp="http://schemas.openxmlformats.org/drawingml/2006/wordprocessingDrawing" xmlns:w10="urn:schemas-microsoft-com:office:word" xmlns:w="http://schemas.openxmlformats.org/wordprocessingml/2006/main" xmlns:w14="http://schemas.microsoft.com/office/word/2010/wordml" xmlns:w15="http://schemas.microsoft.com/office/word/2012/wordml" xmlns:w16cex="http://schemas.microsoft.com/office/word/2018/wordml/cex" xmlns:w16cid="http://schemas.microsoft.com/office/word/2016/wordml/cid" xmlns:w16="http://schemas.microsoft.com/office/word/2018/wordml" xmlns:w16du="http://schemas.microsoft.com/office/word/2023/wordml/word16du" xmlns:w16sdtdh="http://schemas.microsoft.com/office/word/2020/wordml/sdtdatahash" xmlns:w16se="http://schemas.microsoft.com/office/word/2015/wordml/symex" xmlns:wpg="http://schemas.microsoft.com/office/word/2010/wordprocessingGroup" xmlns:wpi="http://schemas.microsoft.com/office/word/2010/wordprocessingInk" xmlns:wne="http://schemas.microsoft.com/office/word/2006/wordml" xmlns:wps="http://schemas.microsoft.com/office/word/2010/wordprocessingShape" mc:Ignorable="w14 w15 w16se w16cid w16 w16cex w16sdtdh w16du wp14">
+<w:numbering xmlns:wpc="http://schemas.microsoft.com/office/word/2010/wordprocessingCanvas" xmlns:cx="http://schemas.microsoft.com/office/drawing/2014/chartex" xmlns:cx1="http://schemas.microsoft.com/office/drawing/2015/9/8/chartex" xmlns:cx2="http://schemas.microsoft.com/office/drawing/2015/10/21/chartex" xmlns:cx3="http://schemas.microsoft.com/office/drawing/2016/5/9/chartex" xmlns:cx4="http://schemas.microsoft.com/office/drawing/2016/5/10/chartex" xmlns:cx5="http://schemas.microsoft.com/office/drawing/2016/5/11/chartex" xmlns:cx6="http://schemas.microsoft.com/office/drawing/2016/5/12/chartex" xmlns:cx7="http://schemas.microsoft.com/office/drawing/2016/5/13/chartex" xmlns:cx8="http://schemas.microsoft.com/office/drawing/2016/5/14/chartex" xmlns:mc="http://schemas.openxmlformats.org/markup-compatibility/2006" xmlns:aink="http://schemas.microsoft.com/office/drawing/2016/ink" xmlns:am3d="http://schemas.microsoft.com/office/drawing/2017/model3d" xmlns:o="urn:schemas-microsoft-com:office:office" xmlns:oel="http://schemas.microsoft.com/office/2019/extlst" xmlns:r="http://schemas.openxmlformats.org/officeDocument/2006/relationships" xmlns:m="http://schemas.openxmlformats.org/officeDocument/2006/math" xmlns:v="urn:schemas-microsoft-com:vml" xmlns:wp14="http://schemas.microsoft.com/office/word/2010/wordprocessingDrawing" xmlns:wp="http://schemas.openxmlformats.org/drawingml/2006/wordprocessingDrawing" xmlns:w10="urn:schemas-microsoft-com:office:word" xmlns:w="http://schemas.openxmlformats.org/wordprocessingml/2006/main" xmlns:w14="http://schemas.microsoft.com/office/word/2010/wordml" xmlns:w15="http://schemas.microsoft.com/office/word/2012/wordml" xmlns:w16cex="http://schemas.microsoft.com/office/word/2018/wordml/cex" xmlns:w16cid="http://schemas.microsoft.com/office/word/2016/wordml/cid" xmlns:w16="http://schemas.microsoft.com/office/word/2018/wordml" xmlns:w16du="http://schemas.microsoft.com/office/word/2023/wordml/word16du" xmlns:w16sdtdh="http://schemas.microsoft.com/office/word/2020/wordml/sdtdatahash" xmlns:w16sdtfl="http://schemas.microsoft.com/office/word/2024/wordml/sdtformatlock" xmlns:w16se="http://schemas.microsoft.com/office/word/2015/wordml/symex" xmlns:wpg="http://schemas.microsoft.com/office/word/2010/wordprocessingGroup" xmlns:wpi="http://schemas.microsoft.com/office/word/2010/wordprocessingInk" xmlns:wne="http://schemas.microsoft.com/office/word/2006/wordml" xmlns:wps="http://schemas.microsoft.com/office/word/2010/wordprocessingShape" mc:Ignorable="w14 w15 w16se w16cid w16 w16cex w16sdtdh w16sdtfl w16du wp14">
   <w:abstractNum w:abstractNumId="0" w15:restartNumberingAfterBreak="0">
     <w:nsid w:val="FFFFFF7C"/>
     <w:multiLevelType w:val="singleLevel"/>
@@ -517,7 +517,7 @@
 </file>
 
 <file path=word/styles.xml><?xml version="1.0" encoding="utf-8"?>
-<w:styles xmlns:mc="http://schemas.openxmlformats.org/markup-compatibility/2006" xmlns:r="http://schemas.openxmlformats.org/officeDocument/2006/relationships" xmlns:w="http://schemas.openxmlformats.org/wordprocessingml/2006/main" xmlns:w14="http://schemas.microsoft.com/office/word/2010/wordml" xmlns:w15="http://schemas.microsoft.com/office/word/2012/wordml" xmlns:w16cex="http://schemas.microsoft.com/office/word/2018/wordml/cex" xmlns:w16cid="http://schemas.microsoft.com/office/word/2016/wordml/cid" xmlns:w16="http://schemas.microsoft.com/office/word/2018/wordml" xmlns:w16du="http://schemas.microsoft.com/office/word/2023/wordml/word16du" xmlns:w16sdtdh="http://schemas.microsoft.com/office/word/2020/wordml/sdtdatahash" xmlns:w16se="http://schemas.microsoft.com/office/word/2015/wordml/symex" mc:Ignorable="w14 w15 w16se w16cid w16 w16cex w16sdtdh w16du">
+<w:styles xmlns:mc="http://schemas.openxmlformats.org/markup-compatibility/2006" xmlns:r="http://schemas.openxmlformats.org/officeDocument/2006/relationships" xmlns:w="http://schemas.openxmlformats.org/wordprocessingml/2006/main" xmlns:w14="http://schemas.microsoft.com/office/word/2010/wordml" xmlns:w15="http://schemas.microsoft.com/office/word/2012/wordml" xmlns:w16cex="http://schemas.microsoft.com/office/word/2018/wordml/cex" xmlns:w16cid="http://schemas.microsoft.com/office/word/2016/wordml/cid" xmlns:w16="http://schemas.microsoft.com/office/word/2018/wordml" xmlns:w16du="http://schemas.microsoft.com/office/word/2023/wordml/word16du" xmlns:w16sdtdh="http://schemas.microsoft.com/office/word/2020/wordml/sdtdatahash" xmlns:w16sdtfl="http://schemas.microsoft.com/office/word/2024/wordml/sdtformatlock" xmlns:w16se="http://schemas.microsoft.com/office/word/2015/wordml/symex" mc:Ignorable="w14 w15 w16se w16cid w16 w16cex w16sdtdh w16sdtfl w16du">
   <w:docDefaults>
     <w:rPrDefault>
       <w:rPr>
@@ -986,7 +986,6 @@
     <w:next w:val="BodyText"/>
     <w:uiPriority w:val="9"/>
     <w:unhideWhenUsed/>
-    <w:qFormat/>
     <w:pPr>
       <w:keepNext/>
       <w:keepLines/>
@@ -1004,7 +1003,6 @@
     <w:next w:val="BodyText"/>
     <w:uiPriority w:val="9"/>
     <w:unhideWhenUsed/>
-    <w:qFormat/>
     <w:pPr>
       <w:keepNext/>
       <w:keepLines/>
@@ -1022,7 +1020,6 @@
     <w:next w:val="BodyText"/>
     <w:uiPriority w:val="9"/>
     <w:unhideWhenUsed/>
-    <w:qFormat/>
     <w:pPr>
       <w:keepNext/>
       <w:keepLines/>
@@ -1040,7 +1037,6 @@
     <w:next w:val="BodyText"/>
     <w:uiPriority w:val="9"/>
     <w:unhideWhenUsed/>
-    <w:qFormat/>
     <w:pPr>
       <w:keepNext/>
       <w:keepLines/>
@@ -1303,10 +1299,10 @@
     <w:name w:val="Verbatim Char"/>
     <w:basedOn w:val="CaptionChar"/>
     <w:link w:val="SourceCode"/>
-    <w:rPr>
-      <w:rFonts w:ascii="Consolas" w:hAnsi="Consolas"/>
-      <w:i/>
-      <w:sz w:val="22"/>
+    <w:rsid w:val="00036EDA"/>
+    <w:rPr>
+      <w:i w:val="0"/>
+      <w:shd w:val="clear" w:color="auto" w:fill="F1F3F5"/>
     </w:rPr>
   </w:style>
   <w:style w:type="character" w:customStyle="1" w:styleId="SectionNumber">
@@ -1379,9 +1375,12 @@
     <w:name w:val="Source Code"/>
     <w:basedOn w:val="Normal"/>
     <w:link w:val="VerbatimChar"/>
+    <w:rsid w:val="00036EDA"/>
     <w:pPr>
       <w:shd w:val="clear" w:color="auto" w:fill="F1F3F5"/>
       <w:wordWrap w:val="0"/>
+      <w:spacing w:after="240" w:line="240" w:lineRule="auto"/>
+      <w:contextualSpacing/>
     </w:pPr>
   </w:style>
   <w:style w:type="character" w:customStyle="1" w:styleId="KeywordTok">
@@ -1389,7 +1388,7 @@
     <w:basedOn w:val="VerbatimChar"/>
     <w:rPr>
       <w:rFonts w:ascii="Consolas" w:hAnsi="Consolas"/>
-      <w:i/>
+      <w:i w:val="0"/>
       <w:color w:val="003B4F"/>
       <w:sz w:val="22"/>
       <w:shd w:val="clear" w:color="auto" w:fill="F1F3F5"/>
@@ -1400,7 +1399,7 @@
     <w:basedOn w:val="VerbatimChar"/>
     <w:rPr>
       <w:rFonts w:ascii="Consolas" w:hAnsi="Consolas"/>
-      <w:i/>
+      <w:i w:val="0"/>
       <w:color w:val="AD0000"/>
       <w:sz w:val="22"/>
       <w:shd w:val="clear" w:color="auto" w:fill="F1F3F5"/>
@@ -1411,7 +1410,7 @@
     <w:basedOn w:val="VerbatimChar"/>
     <w:rPr>
       <w:rFonts w:ascii="Consolas" w:hAnsi="Consolas"/>
-      <w:i/>
+      <w:i w:val="0"/>
       <w:color w:val="AD0000"/>
       <w:sz w:val="22"/>
       <w:shd w:val="clear" w:color="auto" w:fill="F1F3F5"/>
@@ -1422,7 +1421,7 @@
     <w:basedOn w:val="VerbatimChar"/>
     <w:rPr>
       <w:rFonts w:ascii="Consolas" w:hAnsi="Consolas"/>
-      <w:i/>
+      <w:i w:val="0"/>
       <w:color w:val="AD0000"/>
       <w:sz w:val="22"/>
       <w:shd w:val="clear" w:color="auto" w:fill="F1F3F5"/>
@@ -1433,7 +1432,7 @@
     <w:basedOn w:val="VerbatimChar"/>
     <w:rPr>
       <w:rFonts w:ascii="Consolas" w:hAnsi="Consolas"/>
-      <w:i/>
+      <w:i w:val="0"/>
       <w:color w:val="AD0000"/>
       <w:sz w:val="22"/>
       <w:shd w:val="clear" w:color="auto" w:fill="F1F3F5"/>
@@ -1444,7 +1443,7 @@
     <w:basedOn w:val="VerbatimChar"/>
     <w:rPr>
       <w:rFonts w:ascii="Consolas" w:hAnsi="Consolas"/>
-      <w:i/>
+      <w:i w:val="0"/>
       <w:color w:val="8F5902"/>
       <w:sz w:val="22"/>
       <w:shd w:val="clear" w:color="auto" w:fill="F1F3F5"/>
@@ -1455,7 +1454,7 @@
     <w:basedOn w:val="VerbatimChar"/>
     <w:rPr>
       <w:rFonts w:ascii="Consolas" w:hAnsi="Consolas"/>
-      <w:i/>
+      <w:i w:val="0"/>
       <w:color w:val="20794D"/>
       <w:sz w:val="22"/>
       <w:shd w:val="clear" w:color="auto" w:fill="F1F3F5"/>
@@ -1466,58 +1465,91 @@
     <w:basedOn w:val="VerbatimChar"/>
     <w:rPr>
       <w:rFonts w:ascii="Consolas" w:hAnsi="Consolas"/>
+      <w:i w:val="0"/>
+      <w:color w:val="5E5E5E"/>
+      <w:sz w:val="22"/>
+      <w:shd w:val="clear" w:color="auto" w:fill="F1F3F5"/>
+    </w:rPr>
+  </w:style>
+  <w:style w:type="character" w:customStyle="1" w:styleId="StringTok">
+    <w:name w:val="StringTok"/>
+    <w:basedOn w:val="VerbatimChar"/>
+    <w:rPr>
+      <w:rFonts w:ascii="Consolas" w:hAnsi="Consolas"/>
+      <w:i w:val="0"/>
+      <w:color w:val="20794D"/>
+      <w:sz w:val="22"/>
+      <w:shd w:val="clear" w:color="auto" w:fill="F1F3F5"/>
+    </w:rPr>
+  </w:style>
+  <w:style w:type="character" w:customStyle="1" w:styleId="VerbatimStringTok">
+    <w:name w:val="VerbatimStringTok"/>
+    <w:basedOn w:val="VerbatimChar"/>
+    <w:rPr>
+      <w:rFonts w:ascii="Consolas" w:hAnsi="Consolas"/>
+      <w:i w:val="0"/>
+      <w:color w:val="20794D"/>
+      <w:sz w:val="22"/>
+      <w:shd w:val="clear" w:color="auto" w:fill="F1F3F5"/>
+    </w:rPr>
+  </w:style>
+  <w:style w:type="character" w:customStyle="1" w:styleId="SpecialStringTok">
+    <w:name w:val="SpecialStringTok"/>
+    <w:basedOn w:val="VerbatimChar"/>
+    <w:rPr>
+      <w:rFonts w:ascii="Consolas" w:hAnsi="Consolas"/>
+      <w:i w:val="0"/>
+      <w:color w:val="20794D"/>
+      <w:sz w:val="22"/>
+      <w:shd w:val="clear" w:color="auto" w:fill="F1F3F5"/>
+    </w:rPr>
+  </w:style>
+  <w:style w:type="character" w:customStyle="1" w:styleId="ImportTok">
+    <w:name w:val="ImportTok"/>
+    <w:basedOn w:val="VerbatimChar"/>
+    <w:rPr>
+      <w:rFonts w:ascii="Consolas" w:hAnsi="Consolas"/>
+      <w:i w:val="0"/>
+      <w:color w:val="00769E"/>
+      <w:sz w:val="22"/>
+      <w:shd w:val="clear" w:color="auto" w:fill="F1F3F5"/>
+    </w:rPr>
+  </w:style>
+  <w:style w:type="character" w:customStyle="1" w:styleId="CommentTok">
+    <w:name w:val="CommentTok"/>
+    <w:basedOn w:val="VerbatimChar"/>
+    <w:rPr>
+      <w:rFonts w:ascii="Consolas" w:hAnsi="Consolas"/>
+      <w:i w:val="0"/>
+      <w:color w:val="5E5E5E"/>
+      <w:sz w:val="22"/>
+      <w:shd w:val="clear" w:color="auto" w:fill="F1F3F5"/>
+    </w:rPr>
+  </w:style>
+  <w:style w:type="character" w:customStyle="1" w:styleId="DocumentationTok">
+    <w:name w:val="DocumentationTok"/>
+    <w:basedOn w:val="VerbatimChar"/>
+    <w:rPr>
+      <w:rFonts w:ascii="Consolas" w:hAnsi="Consolas"/>
       <w:i/>
       <w:color w:val="5E5E5E"/>
       <w:sz w:val="22"/>
       <w:shd w:val="clear" w:color="auto" w:fill="F1F3F5"/>
     </w:rPr>
   </w:style>
-  <w:style w:type="character" w:customStyle="1" w:styleId="StringTok">
-    <w:name w:val="StringTok"/>
-    <w:basedOn w:val="VerbatimChar"/>
-    <w:rPr>
-      <w:rFonts w:ascii="Consolas" w:hAnsi="Consolas"/>
-      <w:i/>
-      <w:color w:val="20794D"/>
-      <w:sz w:val="22"/>
-      <w:shd w:val="clear" w:color="auto" w:fill="F1F3F5"/>
-    </w:rPr>
-  </w:style>
-  <w:style w:type="character" w:customStyle="1" w:styleId="VerbatimStringTok">
-    <w:name w:val="VerbatimStringTok"/>
-    <w:basedOn w:val="VerbatimChar"/>
-    <w:rPr>
-      <w:rFonts w:ascii="Consolas" w:hAnsi="Consolas"/>
-      <w:i/>
-      <w:color w:val="20794D"/>
-      <w:sz w:val="22"/>
-      <w:shd w:val="clear" w:color="auto" w:fill="F1F3F5"/>
-    </w:rPr>
-  </w:style>
-  <w:style w:type="character" w:customStyle="1" w:styleId="SpecialStringTok">
-    <w:name w:val="SpecialStringTok"/>
-    <w:basedOn w:val="VerbatimChar"/>
-    <w:rPr>
-      <w:rFonts w:ascii="Consolas" w:hAnsi="Consolas"/>
-      <w:i/>
-      <w:color w:val="20794D"/>
-      <w:sz w:val="22"/>
-      <w:shd w:val="clear" w:color="auto" w:fill="F1F3F5"/>
-    </w:rPr>
-  </w:style>
-  <w:style w:type="character" w:customStyle="1" w:styleId="ImportTok">
-    <w:name w:val="ImportTok"/>
-    <w:basedOn w:val="VerbatimChar"/>
-    <w:rPr>
-      <w:rFonts w:ascii="Consolas" w:hAnsi="Consolas"/>
-      <w:i/>
-      <w:color w:val="00769E"/>
-      <w:sz w:val="22"/>
-      <w:shd w:val="clear" w:color="auto" w:fill="F1F3F5"/>
-    </w:rPr>
-  </w:style>
-  <w:style w:type="character" w:customStyle="1" w:styleId="CommentTok">
-    <w:name w:val="CommentTok"/>
+  <w:style w:type="character" w:customStyle="1" w:styleId="AnnotationTok">
+    <w:name w:val="AnnotationTok"/>
+    <w:basedOn w:val="VerbatimChar"/>
+    <w:rPr>
+      <w:rFonts w:ascii="Consolas" w:hAnsi="Consolas"/>
+      <w:i w:val="0"/>
+      <w:color w:val="5E5E5E"/>
+      <w:sz w:val="22"/>
+      <w:shd w:val="clear" w:color="auto" w:fill="F1F3F5"/>
+    </w:rPr>
+  </w:style>
+  <w:style w:type="character" w:customStyle="1" w:styleId="CommentVarTok">
+    <w:name w:val="CommentVarTok"/>
     <w:basedOn w:val="VerbatimChar"/>
     <w:rPr>
       <w:rFonts w:ascii="Consolas" w:hAnsi="Consolas"/>
@@ -1527,8 +1559,52 @@
       <w:shd w:val="clear" w:color="auto" w:fill="F1F3F5"/>
     </w:rPr>
   </w:style>
-  <w:style w:type="character" w:customStyle="1" w:styleId="DocumentationTok">
-    <w:name w:val="DocumentationTok"/>
+  <w:style w:type="character" w:customStyle="1" w:styleId="OtherTok">
+    <w:name w:val="OtherTok"/>
+    <w:basedOn w:val="VerbatimChar"/>
+    <w:rPr>
+      <w:rFonts w:ascii="Consolas" w:hAnsi="Consolas"/>
+      <w:i w:val="0"/>
+      <w:color w:val="003B4F"/>
+      <w:sz w:val="22"/>
+      <w:shd w:val="clear" w:color="auto" w:fill="F1F3F5"/>
+    </w:rPr>
+  </w:style>
+  <w:style w:type="character" w:customStyle="1" w:styleId="FunctionTok">
+    <w:name w:val="FunctionTok"/>
+    <w:basedOn w:val="VerbatimChar"/>
+    <w:rPr>
+      <w:rFonts w:ascii="Consolas" w:hAnsi="Consolas"/>
+      <w:i w:val="0"/>
+      <w:color w:val="4758AB"/>
+      <w:sz w:val="22"/>
+      <w:shd w:val="clear" w:color="auto" w:fill="F1F3F5"/>
+    </w:rPr>
+  </w:style>
+  <w:style w:type="character" w:customStyle="1" w:styleId="VariableTok">
+    <w:name w:val="VariableTok"/>
+    <w:basedOn w:val="VerbatimChar"/>
+    <w:rPr>
+      <w:rFonts w:ascii="Consolas" w:hAnsi="Consolas"/>
+      <w:i w:val="0"/>
+      <w:color w:val="111111"/>
+      <w:sz w:val="22"/>
+      <w:shd w:val="clear" w:color="auto" w:fill="F1F3F5"/>
+    </w:rPr>
+  </w:style>
+  <w:style w:type="character" w:customStyle="1" w:styleId="ControlFlowTok">
+    <w:name w:val="ControlFlowTok"/>
+    <w:basedOn w:val="VerbatimChar"/>
+    <w:rPr>
+      <w:rFonts w:ascii="Consolas" w:hAnsi="Consolas"/>
+      <w:i w:val="0"/>
+      <w:color w:val="003B4F"/>
+      <w:sz w:val="22"/>
+      <w:shd w:val="clear" w:color="auto" w:fill="F1F3F5"/>
+    </w:rPr>
+  </w:style>
+  <w:style w:type="character" w:customStyle="1" w:styleId="OperatorTok">
+    <w:name w:val="OperatorTok"/>
     <w:basedOn w:val="VerbatimChar"/>
     <w:rPr>
       <w:rFonts w:ascii="Consolas" w:hAnsi="Consolas"/>
@@ -1538,8 +1614,74 @@
       <w:shd w:val="clear" w:color="auto" w:fill="F1F3F5"/>
     </w:rPr>
   </w:style>
-  <w:style w:type="character" w:customStyle="1" w:styleId="AnnotationTok">
-    <w:name w:val="AnnotationTok"/>
+  <w:style w:type="character" w:customStyle="1" w:styleId="BuiltInTok">
+    <w:name w:val="BuiltInTok"/>
+    <w:basedOn w:val="VerbatimChar"/>
+    <w:rPr>
+      <w:rFonts w:ascii="Consolas" w:hAnsi="Consolas"/>
+      <w:i w:val="0"/>
+      <w:color w:val="003B4F"/>
+      <w:sz w:val="22"/>
+      <w:shd w:val="clear" w:color="auto" w:fill="F1F3F5"/>
+    </w:rPr>
+  </w:style>
+  <w:style w:type="character" w:customStyle="1" w:styleId="ExtensionTok">
+    <w:name w:val="ExtensionTok"/>
+    <w:basedOn w:val="VerbatimChar"/>
+    <w:rPr>
+      <w:rFonts w:ascii="Consolas" w:hAnsi="Consolas"/>
+      <w:i w:val="0"/>
+      <w:color w:val="003B4F"/>
+      <w:sz w:val="22"/>
+      <w:shd w:val="clear" w:color="auto" w:fill="F1F3F5"/>
+    </w:rPr>
+  </w:style>
+  <w:style w:type="character" w:customStyle="1" w:styleId="PreprocessorTok">
+    <w:name w:val="PreprocessorTok"/>
+    <w:basedOn w:val="VerbatimChar"/>
+    <w:rPr>
+      <w:rFonts w:ascii="Consolas" w:hAnsi="Consolas"/>
+      <w:i w:val="0"/>
+      <w:color w:val="AD0000"/>
+      <w:sz w:val="22"/>
+      <w:shd w:val="clear" w:color="auto" w:fill="F1F3F5"/>
+    </w:rPr>
+  </w:style>
+  <w:style w:type="character" w:customStyle="1" w:styleId="AttributeTok">
+    <w:name w:val="AttributeTok"/>
+    <w:basedOn w:val="VerbatimChar"/>
+    <w:rPr>
+      <w:rFonts w:ascii="Consolas" w:hAnsi="Consolas"/>
+      <w:i w:val="0"/>
+      <w:color w:val="657422"/>
+      <w:sz w:val="22"/>
+      <w:shd w:val="clear" w:color="auto" w:fill="F1F3F5"/>
+    </w:rPr>
+  </w:style>
+  <w:style w:type="character" w:customStyle="1" w:styleId="RegionMarkerTok">
+    <w:name w:val="RegionMarkerTok"/>
+    <w:basedOn w:val="VerbatimChar"/>
+    <w:rPr>
+      <w:rFonts w:ascii="Consolas" w:hAnsi="Consolas"/>
+      <w:i w:val="0"/>
+      <w:color w:val="003B4F"/>
+      <w:sz w:val="22"/>
+      <w:shd w:val="clear" w:color="auto" w:fill="F1F3F5"/>
+    </w:rPr>
+  </w:style>
+  <w:style w:type="character" w:customStyle="1" w:styleId="InformationTok">
+    <w:name w:val="InformationTok"/>
+    <w:basedOn w:val="VerbatimChar"/>
+    <w:rPr>
+      <w:rFonts w:ascii="Consolas" w:hAnsi="Consolas"/>
+      <w:i w:val="0"/>
+      <w:color w:val="5E5E5E"/>
+      <w:sz w:val="22"/>
+      <w:shd w:val="clear" w:color="auto" w:fill="F1F3F5"/>
+    </w:rPr>
+  </w:style>
+  <w:style w:type="character" w:customStyle="1" w:styleId="WarningTok">
+    <w:name w:val="WarningTok"/>
     <w:basedOn w:val="VerbatimChar"/>
     <w:rPr>
       <w:rFonts w:ascii="Consolas" w:hAnsi="Consolas"/>
@@ -1549,155 +1691,12 @@
       <w:shd w:val="clear" w:color="auto" w:fill="F1F3F5"/>
     </w:rPr>
   </w:style>
-  <w:style w:type="character" w:customStyle="1" w:styleId="CommentVarTok">
-    <w:name w:val="CommentVarTok"/>
-    <w:basedOn w:val="VerbatimChar"/>
-    <w:rPr>
-      <w:rFonts w:ascii="Consolas" w:hAnsi="Consolas"/>
-      <w:i w:val="0"/>
-      <w:color w:val="5E5E5E"/>
-      <w:sz w:val="22"/>
-      <w:shd w:val="clear" w:color="auto" w:fill="F1F3F5"/>
-    </w:rPr>
-  </w:style>
-  <w:style w:type="character" w:customStyle="1" w:styleId="OtherTok">
-    <w:name w:val="OtherTok"/>
-    <w:basedOn w:val="VerbatimChar"/>
-    <w:rPr>
-      <w:rFonts w:ascii="Consolas" w:hAnsi="Consolas"/>
-      <w:i/>
-      <w:color w:val="003B4F"/>
-      <w:sz w:val="22"/>
-      <w:shd w:val="clear" w:color="auto" w:fill="F1F3F5"/>
-    </w:rPr>
-  </w:style>
-  <w:style w:type="character" w:customStyle="1" w:styleId="FunctionTok">
-    <w:name w:val="FunctionTok"/>
-    <w:basedOn w:val="VerbatimChar"/>
-    <w:rPr>
-      <w:rFonts w:ascii="Consolas" w:hAnsi="Consolas"/>
-      <w:i/>
-      <w:color w:val="4758AB"/>
-      <w:sz w:val="22"/>
-      <w:shd w:val="clear" w:color="auto" w:fill="F1F3F5"/>
-    </w:rPr>
-  </w:style>
-  <w:style w:type="character" w:customStyle="1" w:styleId="VariableTok">
-    <w:name w:val="VariableTok"/>
-    <w:basedOn w:val="VerbatimChar"/>
-    <w:rPr>
-      <w:rFonts w:ascii="Consolas" w:hAnsi="Consolas"/>
-      <w:i/>
-      <w:color w:val="111111"/>
-      <w:sz w:val="22"/>
-      <w:shd w:val="clear" w:color="auto" w:fill="F1F3F5"/>
-    </w:rPr>
-  </w:style>
-  <w:style w:type="character" w:customStyle="1" w:styleId="ControlFlowTok">
-    <w:name w:val="ControlFlowTok"/>
-    <w:basedOn w:val="VerbatimChar"/>
-    <w:rPr>
-      <w:rFonts w:ascii="Consolas" w:hAnsi="Consolas"/>
-      <w:i/>
-      <w:color w:val="003B4F"/>
-      <w:sz w:val="22"/>
-      <w:shd w:val="clear" w:color="auto" w:fill="F1F3F5"/>
-    </w:rPr>
-  </w:style>
-  <w:style w:type="character" w:customStyle="1" w:styleId="OperatorTok">
-    <w:name w:val="OperatorTok"/>
-    <w:basedOn w:val="VerbatimChar"/>
-    <w:rPr>
-      <w:rFonts w:ascii="Consolas" w:hAnsi="Consolas"/>
-      <w:i/>
-      <w:color w:val="5E5E5E"/>
-      <w:sz w:val="22"/>
-      <w:shd w:val="clear" w:color="auto" w:fill="F1F3F5"/>
-    </w:rPr>
-  </w:style>
-  <w:style w:type="character" w:customStyle="1" w:styleId="BuiltInTok">
-    <w:name w:val="BuiltInTok"/>
-    <w:basedOn w:val="VerbatimChar"/>
-    <w:rPr>
-      <w:rFonts w:ascii="Consolas" w:hAnsi="Consolas"/>
-      <w:i/>
-      <w:color w:val="003B4F"/>
-      <w:sz w:val="22"/>
-      <w:shd w:val="clear" w:color="auto" w:fill="F1F3F5"/>
-    </w:rPr>
-  </w:style>
-  <w:style w:type="character" w:customStyle="1" w:styleId="ExtensionTok">
-    <w:name w:val="ExtensionTok"/>
-    <w:basedOn w:val="VerbatimChar"/>
-    <w:rPr>
-      <w:rFonts w:ascii="Consolas" w:hAnsi="Consolas"/>
-      <w:i/>
-      <w:color w:val="003B4F"/>
-      <w:sz w:val="22"/>
-      <w:shd w:val="clear" w:color="auto" w:fill="F1F3F5"/>
-    </w:rPr>
-  </w:style>
-  <w:style w:type="character" w:customStyle="1" w:styleId="PreprocessorTok">
-    <w:name w:val="PreprocessorTok"/>
-    <w:basedOn w:val="VerbatimChar"/>
-    <w:rPr>
-      <w:rFonts w:ascii="Consolas" w:hAnsi="Consolas"/>
-      <w:i/>
-      <w:color w:val="AD0000"/>
-      <w:sz w:val="22"/>
-      <w:shd w:val="clear" w:color="auto" w:fill="F1F3F5"/>
-    </w:rPr>
-  </w:style>
-  <w:style w:type="character" w:customStyle="1" w:styleId="AttributeTok">
-    <w:name w:val="AttributeTok"/>
-    <w:basedOn w:val="VerbatimChar"/>
-    <w:rPr>
-      <w:rFonts w:ascii="Consolas" w:hAnsi="Consolas"/>
-      <w:i/>
-      <w:color w:val="657422"/>
-      <w:sz w:val="22"/>
-      <w:shd w:val="clear" w:color="auto" w:fill="F1F3F5"/>
-    </w:rPr>
-  </w:style>
-  <w:style w:type="character" w:customStyle="1" w:styleId="RegionMarkerTok">
-    <w:name w:val="RegionMarkerTok"/>
-    <w:basedOn w:val="VerbatimChar"/>
-    <w:rPr>
-      <w:rFonts w:ascii="Consolas" w:hAnsi="Consolas"/>
-      <w:i/>
-      <w:color w:val="003B4F"/>
-      <w:sz w:val="22"/>
-      <w:shd w:val="clear" w:color="auto" w:fill="F1F3F5"/>
-    </w:rPr>
-  </w:style>
-  <w:style w:type="character" w:customStyle="1" w:styleId="InformationTok">
-    <w:name w:val="InformationTok"/>
-    <w:basedOn w:val="VerbatimChar"/>
-    <w:rPr>
-      <w:rFonts w:ascii="Consolas" w:hAnsi="Consolas"/>
-      <w:i/>
-      <w:color w:val="5E5E5E"/>
-      <w:sz w:val="22"/>
-      <w:shd w:val="clear" w:color="auto" w:fill="F1F3F5"/>
-    </w:rPr>
-  </w:style>
-  <w:style w:type="character" w:customStyle="1" w:styleId="WarningTok">
-    <w:name w:val="WarningTok"/>
-    <w:basedOn w:val="VerbatimChar"/>
-    <w:rPr>
-      <w:rFonts w:ascii="Consolas" w:hAnsi="Consolas"/>
-      <w:i w:val="0"/>
-      <w:color w:val="5E5E5E"/>
-      <w:sz w:val="22"/>
-      <w:shd w:val="clear" w:color="auto" w:fill="F1F3F5"/>
-    </w:rPr>
-  </w:style>
   <w:style w:type="character" w:customStyle="1" w:styleId="AlertTok">
     <w:name w:val="AlertTok"/>
     <w:basedOn w:val="VerbatimChar"/>
     <w:rPr>
       <w:rFonts w:ascii="Consolas" w:hAnsi="Consolas"/>
-      <w:i/>
+      <w:i w:val="0"/>
       <w:color w:val="AD0000"/>
       <w:sz w:val="22"/>
       <w:shd w:val="clear" w:color="auto" w:fill="F1F3F5"/>
@@ -1708,7 +1707,7 @@
     <w:basedOn w:val="VerbatimChar"/>
     <w:rPr>
       <w:rFonts w:ascii="Consolas" w:hAnsi="Consolas"/>
-      <w:i/>
+      <w:i w:val="0"/>
       <w:color w:val="AD0000"/>
       <w:sz w:val="22"/>
       <w:shd w:val="clear" w:color="auto" w:fill="F1F3F5"/>
@@ -1719,7 +1718,7 @@
     <w:basedOn w:val="VerbatimChar"/>
     <w:rPr>
       <w:rFonts w:ascii="Consolas" w:hAnsi="Consolas"/>
-      <w:i/>
+      <w:i w:val="0"/>
       <w:color w:val="003B4F"/>
       <w:sz w:val="22"/>
       <w:shd w:val="clear" w:color="auto" w:fill="F1F3F5"/>
@@ -2004,7 +2003,7 @@
 </file>
 
 <file path=word/glossary/document.xml><?xml version="1.0" encoding="utf-8"?>
-<w:glossaryDocument xmlns:wpc="http://schemas.microsoft.com/office/word/2010/wordprocessingCanvas" xmlns:cx="http://schemas.microsoft.com/office/drawing/2014/chartex" xmlns:cx1="http://schemas.microsoft.com/office/drawing/2015/9/8/chartex" xmlns:cx2="http://schemas.microsoft.com/office/drawing/2015/10/21/chartex" xmlns:cx3="http://schemas.microsoft.com/office/drawing/2016/5/9/chartex" xmlns:cx4="http://schemas.microsoft.com/office/drawing/2016/5/10/chartex" xmlns:cx5="http://schemas.microsoft.com/office/drawing/2016/5/11/chartex" xmlns:cx6="http://schemas.microsoft.com/office/drawing/2016/5/12/chartex" xmlns:cx7="http://schemas.microsoft.com/office/drawing/2016/5/13/chartex" xmlns:cx8="http://schemas.microsoft.com/office/drawing/2016/5/14/chartex" xmlns:mc="http://schemas.openxmlformats.org/markup-compatibility/2006" xmlns:aink="http://schemas.microsoft.com/office/drawing/2016/ink" xmlns:am3d="http://schemas.microsoft.com/office/drawing/2017/model3d" xmlns:o="urn:schemas-microsoft-com:office:office" xmlns:oel="http://schemas.microsoft.com/office/2019/extlst" xmlns:r="http://schemas.openxmlformats.org/officeDocument/2006/relationships" xmlns:m="http://schemas.openxmlformats.org/officeDocument/2006/math" xmlns:v="urn:schemas-microsoft-com:vml" xmlns:wp14="http://schemas.microsoft.com/office/word/2010/wordprocessingDrawing" xmlns:wp="http://schemas.openxmlformats.org/drawingml/2006/wordprocessingDrawing" xmlns:w10="urn:schemas-microsoft-com:office:word" xmlns:w="http://schemas.openxmlformats.org/wordprocessingml/2006/main" xmlns:w14="http://schemas.microsoft.com/office/word/2010/wordml" xmlns:w15="http://schemas.microsoft.com/office/word/2012/wordml" xmlns:w16cex="http://schemas.microsoft.com/office/word/2018/wordml/cex" xmlns:w16cid="http://schemas.microsoft.com/office/word/2016/wordml/cid" xmlns:w16="http://schemas.microsoft.com/office/word/2018/wordml" xmlns:w16du="http://schemas.microsoft.com/office/word/2023/wordml/word16du" xmlns:w16sdtdh="http://schemas.microsoft.com/office/word/2020/wordml/sdtdatahash" xmlns:w16se="http://schemas.microsoft.com/office/word/2015/wordml/symex" xmlns:wpg="http://schemas.microsoft.com/office/word/2010/wordprocessingGroup" xmlns:wpi="http://schemas.microsoft.com/office/word/2010/wordprocessingInk" xmlns:wne="http://schemas.microsoft.com/office/word/2006/wordml" xmlns:wps="http://schemas.microsoft.com/office/word/2010/wordprocessingShape" mc:Ignorable="w14 w15 w16se w16cid w16 w16cex w16sdtdh w16du wp14">
+<w:glossaryDocument xmlns:wpc="http://schemas.microsoft.com/office/word/2010/wordprocessingCanvas" xmlns:cx="http://schemas.microsoft.com/office/drawing/2014/chartex" xmlns:cx1="http://schemas.microsoft.com/office/drawing/2015/9/8/chartex" xmlns:cx2="http://schemas.microsoft.com/office/drawing/2015/10/21/chartex" xmlns:cx3="http://schemas.microsoft.com/office/drawing/2016/5/9/chartex" xmlns:cx4="http://schemas.microsoft.com/office/drawing/2016/5/10/chartex" xmlns:cx5="http://schemas.microsoft.com/office/drawing/2016/5/11/chartex" xmlns:cx6="http://schemas.microsoft.com/office/drawing/2016/5/12/chartex" xmlns:cx7="http://schemas.microsoft.com/office/drawing/2016/5/13/chartex" xmlns:cx8="http://schemas.microsoft.com/office/drawing/2016/5/14/chartex" xmlns:mc="http://schemas.openxmlformats.org/markup-compatibility/2006" xmlns:aink="http://schemas.microsoft.com/office/drawing/2016/ink" xmlns:am3d="http://schemas.microsoft.com/office/drawing/2017/model3d" xmlns:o="urn:schemas-microsoft-com:office:office" xmlns:oel="http://schemas.microsoft.com/office/2019/extlst" xmlns:r="http://schemas.openxmlformats.org/officeDocument/2006/relationships" xmlns:m="http://schemas.openxmlformats.org/officeDocument/2006/math" xmlns:v="urn:schemas-microsoft-com:vml" xmlns:wp14="http://schemas.microsoft.com/office/word/2010/wordprocessingDrawing" xmlns:wp="http://schemas.openxmlformats.org/drawingml/2006/wordprocessingDrawing" xmlns:w10="urn:schemas-microsoft-com:office:word" xmlns:w="http://schemas.openxmlformats.org/wordprocessingml/2006/main" xmlns:w14="http://schemas.microsoft.com/office/word/2010/wordml" xmlns:w15="http://schemas.microsoft.com/office/word/2012/wordml" xmlns:w16cex="http://schemas.microsoft.com/office/word/2018/wordml/cex" xmlns:w16cid="http://schemas.microsoft.com/office/word/2016/wordml/cid" xmlns:w16="http://schemas.microsoft.com/office/word/2018/wordml" xmlns:w16du="http://schemas.microsoft.com/office/word/2023/wordml/word16du" xmlns:w16sdtdh="http://schemas.microsoft.com/office/word/2020/wordml/sdtdatahash" xmlns:w16sdtfl="http://schemas.microsoft.com/office/word/2024/wordml/sdtformatlock" xmlns:w16se="http://schemas.microsoft.com/office/word/2015/wordml/symex" xmlns:wpg="http://schemas.microsoft.com/office/word/2010/wordprocessingGroup" xmlns:wpi="http://schemas.microsoft.com/office/word/2010/wordprocessingInk" xmlns:wne="http://schemas.microsoft.com/office/word/2006/wordml" xmlns:wps="http://schemas.microsoft.com/office/word/2010/wordprocessingShape" mc:Ignorable="w14 w15 w16se w16cid w16 w16cex w16sdtdh w16sdtfl w16du wp14">
   <w:docParts>
     <w:docPart>
       <w:docPartPr>
@@ -2037,7 +2036,7 @@
 </file>
 
 <file path=word/glossary/fontTable.xml><?xml version="1.0" encoding="utf-8"?>
-<w:fonts xmlns:mc="http://schemas.openxmlformats.org/markup-compatibility/2006" xmlns:r="http://schemas.openxmlformats.org/officeDocument/2006/relationships" xmlns:w="http://schemas.openxmlformats.org/wordprocessingml/2006/main" xmlns:w14="http://schemas.microsoft.com/office/word/2010/wordml" xmlns:w15="http://schemas.microsoft.com/office/word/2012/wordml" xmlns:w16cex="http://schemas.microsoft.com/office/word/2018/wordml/cex" xmlns:w16cid="http://schemas.microsoft.com/office/word/2016/wordml/cid" xmlns:w16="http://schemas.microsoft.com/office/word/2018/wordml" xmlns:w16du="http://schemas.microsoft.com/office/word/2023/wordml/word16du" xmlns:w16sdtdh="http://schemas.microsoft.com/office/word/2020/wordml/sdtdatahash" xmlns:w16se="http://schemas.microsoft.com/office/word/2015/wordml/symex" mc:Ignorable="w14 w15 w16se w16cid w16 w16cex w16sdtdh w16du">
+<w:fonts xmlns:mc="http://schemas.openxmlformats.org/markup-compatibility/2006" xmlns:r="http://schemas.openxmlformats.org/officeDocument/2006/relationships" xmlns:w="http://schemas.openxmlformats.org/wordprocessingml/2006/main" xmlns:w14="http://schemas.microsoft.com/office/word/2010/wordml" xmlns:w15="http://schemas.microsoft.com/office/word/2012/wordml" xmlns:w16cex="http://schemas.microsoft.com/office/word/2018/wordml/cex" xmlns:w16cid="http://schemas.microsoft.com/office/word/2016/wordml/cid" xmlns:w16="http://schemas.microsoft.com/office/word/2018/wordml" xmlns:w16du="http://schemas.microsoft.com/office/word/2023/wordml/word16du" xmlns:w16sdtdh="http://schemas.microsoft.com/office/word/2020/wordml/sdtdatahash" xmlns:w16sdtfl="http://schemas.microsoft.com/office/word/2024/wordml/sdtformatlock" xmlns:w16se="http://schemas.microsoft.com/office/word/2015/wordml/symex" mc:Ignorable="w14 w15 w16se w16cid w16 w16cex w16sdtdh w16sdtfl w16du">
   <w:font w:name="Symbol">
     <w:panose1 w:val="05050102010706020507"/>
     <w:charset w:val="02"/>
@@ -2075,7 +2074,7 @@
 </file>
 
 <file path=word/glossary/settings.xml><?xml version="1.0" encoding="utf-8"?>
-<w:settings xmlns:mc="http://schemas.openxmlformats.org/markup-compatibility/2006" xmlns:o="urn:schemas-microsoft-com:office:office" xmlns:r="http://schemas.openxmlformats.org/officeDocument/2006/relationships" xmlns:m="http://schemas.openxmlformats.org/officeDocument/2006/math" xmlns:v="urn:schemas-microsoft-com:vml" xmlns:w10="urn:schemas-microsoft-com:office:word" xmlns:w="http://schemas.openxmlformats.org/wordprocessingml/2006/main" xmlns:w14="http://schemas.microsoft.com/office/word/2010/wordml" xmlns:w15="http://schemas.microsoft.com/office/word/2012/wordml" xmlns:w16cex="http://schemas.microsoft.com/office/word/2018/wordml/cex" xmlns:w16cid="http://schemas.microsoft.com/office/word/2016/wordml/cid" xmlns:w16="http://schemas.microsoft.com/office/word/2018/wordml" xmlns:w16du="http://schemas.microsoft.com/office/word/2023/wordml/word16du" xmlns:w16sdtdh="http://schemas.microsoft.com/office/word/2020/wordml/sdtdatahash" xmlns:w16se="http://schemas.microsoft.com/office/word/2015/wordml/symex" xmlns:sl="http://schemas.openxmlformats.org/schemaLibrary/2006/main" mc:Ignorable="w14 w15 w16se w16cid w16 w16cex w16sdtdh w16du">
+<w:settings xmlns:mc="http://schemas.openxmlformats.org/markup-compatibility/2006" xmlns:o="urn:schemas-microsoft-com:office:office" xmlns:r="http://schemas.openxmlformats.org/officeDocument/2006/relationships" xmlns:m="http://schemas.openxmlformats.org/officeDocument/2006/math" xmlns:v="urn:schemas-microsoft-com:vml" xmlns:w10="urn:schemas-microsoft-com:office:word" xmlns:w="http://schemas.openxmlformats.org/wordprocessingml/2006/main" xmlns:w14="http://schemas.microsoft.com/office/word/2010/wordml" xmlns:w15="http://schemas.microsoft.com/office/word/2012/wordml" xmlns:w16cex="http://schemas.microsoft.com/office/word/2018/wordml/cex" xmlns:w16cid="http://schemas.microsoft.com/office/word/2016/wordml/cid" xmlns:w16="http://schemas.microsoft.com/office/word/2018/wordml" xmlns:w16du="http://schemas.microsoft.com/office/word/2023/wordml/word16du" xmlns:w16sdtdh="http://schemas.microsoft.com/office/word/2020/wordml/sdtdatahash" xmlns:w16sdtfl="http://schemas.microsoft.com/office/word/2024/wordml/sdtformatlock" xmlns:w16se="http://schemas.microsoft.com/office/word/2015/wordml/symex" xmlns:sl="http://schemas.openxmlformats.org/schemaLibrary/2006/main" mc:Ignorable="w14 w15 w16se w16cid w16 w16cex w16sdtdh w16sdtfl w16du">
   <w:view w:val="normal"/>
   <w:defaultTabStop w:val="720"/>
   <w:characterSpacingControl w:val="doNotCompress"/>
@@ -2096,16 +2095,22 @@
     <w:rsid w:val="001F3CEE"/>
     <w:rsid w:val="00221DB6"/>
     <w:rsid w:val="00266742"/>
+    <w:rsid w:val="002E7A3C"/>
+    <w:rsid w:val="003402EC"/>
     <w:rsid w:val="00440287"/>
     <w:rsid w:val="004739F0"/>
     <w:rsid w:val="004F6D10"/>
     <w:rsid w:val="005702F2"/>
     <w:rsid w:val="005B1707"/>
+    <w:rsid w:val="0061553F"/>
     <w:rsid w:val="007139D3"/>
     <w:rsid w:val="00843AF0"/>
     <w:rsid w:val="00B139B1"/>
     <w:rsid w:val="00B34FB5"/>
+    <w:rsid w:val="00CE12A2"/>
     <w:rsid w:val="00D34E1D"/>
+    <w:rsid w:val="00E37D61"/>
+    <w:rsid w:val="00FC515E"/>
   </w:rsids>
   <m:mathPr>
     <m:mathFont m:val="Cambria Math"/>
@@ -2129,7 +2134,7 @@
 </file>
 
 <file path=word/glossary/styles.xml><?xml version="1.0" encoding="utf-8"?>
-<w:styles xmlns:mc="http://schemas.openxmlformats.org/markup-compatibility/2006" xmlns:r="http://schemas.openxmlformats.org/officeDocument/2006/relationships" xmlns:w="http://schemas.openxmlformats.org/wordprocessingml/2006/main" xmlns:w14="http://schemas.microsoft.com/office/word/2010/wordml" xmlns:w15="http://schemas.microsoft.com/office/word/2012/wordml" xmlns:w16cex="http://schemas.microsoft.com/office/word/2018/wordml/cex" xmlns:w16cid="http://schemas.microsoft.com/office/word/2016/wordml/cid" xmlns:w16="http://schemas.microsoft.com/office/word/2018/wordml" xmlns:w16du="http://schemas.microsoft.com/office/word/2023/wordml/word16du" xmlns:w16sdtdh="http://schemas.microsoft.com/office/word/2020/wordml/sdtdatahash" xmlns:w16se="http://schemas.microsoft.com/office/word/2015/wordml/symex" mc:Ignorable="w14 w15 w16se w16cid w16 w16cex w16sdtdh w16du">
+<w:styles xmlns:mc="http://schemas.openxmlformats.org/markup-compatibility/2006" xmlns:r="http://schemas.openxmlformats.org/officeDocument/2006/relationships" xmlns:w="http://schemas.openxmlformats.org/wordprocessingml/2006/main" xmlns:w14="http://schemas.microsoft.com/office/word/2010/wordml" xmlns:w15="http://schemas.microsoft.com/office/word/2012/wordml" xmlns:w16cex="http://schemas.microsoft.com/office/word/2018/wordml/cex" xmlns:w16cid="http://schemas.microsoft.com/office/word/2016/wordml/cid" xmlns:w16="http://schemas.microsoft.com/office/word/2018/wordml" xmlns:w16du="http://schemas.microsoft.com/office/word/2023/wordml/word16du" xmlns:w16sdtdh="http://schemas.microsoft.com/office/word/2020/wordml/sdtdatahash" xmlns:w16sdtfl="http://schemas.microsoft.com/office/word/2024/wordml/sdtformatlock" xmlns:w16se="http://schemas.microsoft.com/office/word/2015/wordml/symex" mc:Ignorable="w14 w15 w16se w16cid w16 w16cex w16sdtdh w16sdtfl w16du">
   <w:docDefaults>
     <w:rPrDefault>
       <w:rPr>
@@ -2575,7 +2580,7 @@
 </file>
 
 <file path=word/glossary/webSettings.xml><?xml version="1.0" encoding="utf-8"?>
-<w:webSettings xmlns:mc="http://schemas.openxmlformats.org/markup-compatibility/2006" xmlns:r="http://schemas.openxmlformats.org/officeDocument/2006/relationships" xmlns:w="http://schemas.openxmlformats.org/wordprocessingml/2006/main" xmlns:w14="http://schemas.microsoft.com/office/word/2010/wordml" xmlns:w15="http://schemas.microsoft.com/office/word/2012/wordml" xmlns:w16cex="http://schemas.microsoft.com/office/word/2018/wordml/cex" xmlns:w16cid="http://schemas.microsoft.com/office/word/2016/wordml/cid" xmlns:w16="http://schemas.microsoft.com/office/word/2018/wordml" xmlns:w16du="http://schemas.microsoft.com/office/word/2023/wordml/word16du" xmlns:w16sdtdh="http://schemas.microsoft.com/office/word/2020/wordml/sdtdatahash" xmlns:w16se="http://schemas.microsoft.com/office/word/2015/wordml/symex" mc:Ignorable="w14 w15 w16se w16cid w16 w16cex w16sdtdh w16du">
+<w:webSettings xmlns:mc="http://schemas.openxmlformats.org/markup-compatibility/2006" xmlns:r="http://schemas.openxmlformats.org/officeDocument/2006/relationships" xmlns:w="http://schemas.openxmlformats.org/wordprocessingml/2006/main" xmlns:w14="http://schemas.microsoft.com/office/word/2010/wordml" xmlns:w15="http://schemas.microsoft.com/office/word/2012/wordml" xmlns:w16cex="http://schemas.microsoft.com/office/word/2018/wordml/cex" xmlns:w16cid="http://schemas.microsoft.com/office/word/2016/wordml/cid" xmlns:w16="http://schemas.microsoft.com/office/word/2018/wordml" xmlns:w16du="http://schemas.microsoft.com/office/word/2023/wordml/word16du" xmlns:w16sdtdh="http://schemas.microsoft.com/office/word/2020/wordml/sdtdatahash" xmlns:w16sdtfl="http://schemas.microsoft.com/office/word/2024/wordml/sdtformatlock" xmlns:w16se="http://schemas.microsoft.com/office/word/2015/wordml/symex" mc:Ignorable="w14 w15 w16se w16cid w16 w16cex w16sdtdh w16sdtfl w16du">
   <w:optimizeForBrowser/>
   <w:relyOnVML/>
   <w:allowPNG/>

</xml_diff>

<commit_message>
address Lisa's comments (repro validation is pending)
</commit_message>
<xml_diff>
--- a/_extensions/wjschne/apaquarto/apaquarto.docx
+++ b/_extensions/wjschne/apaquarto/apaquarto.docx
@@ -4,7 +4,7 @@
   <w:body>
     <w:p>
       <w:pPr>
-        <w:pStyle w:val="AbstractFirstParagraph"/>
+        <w:pStyle w:val="SubPanelNote"/>
       </w:pPr>
     </w:p>
     <w:sectPr>
@@ -14,7 +14,7 @@
       <w:footerReference w:type="default" r:id="rId11"/>
       <w:headerReference w:type="first" r:id="rId12"/>
       <w:footerReference w:type="first" r:id="rId13"/>
-      <w:pgSz w:w="12240" w:h="15840"/>
+      <w:pgSz w:w="12240" w:h="15840" w:code="1"/>
       <w:pgMar w:top="1440" w:right="1440" w:bottom="1440" w:left="1440" w:header="720" w:footer="720" w:gutter="0"/>
       <w:cols w:space="720"/>
     </w:sectPr>
@@ -108,6 +108,7 @@
         <w:tab w:val="right" w:pos="9360"/>
       </w:tabs>
     </w:pPr>
+    <!-- apaquarto-original-runninghead: <w:sdt><w:sdtPr><w:alias w:val="Comments"/><w:tag w:val=""/><w:id w:val="411821190"/><w:placeholder><w:docPart w:val="0C02FC99099648D19246354A6487E13A"/></w:placeholder><w:showingPlcHdr/><w:dataBinding w:prefixMappings="xmlns:ns0='http://purl.org/dc/elements/1.1/' xmlns:ns1='http://schemas.openxmlformats.org/package/2006/metadata/core-properties' " w:xpath="/ns1:coreProperties[1]/ns0:description[1]" w:storeItemID="{6C3C8BC8-F283-45AE-878A-BAB7291924A1}"/><w:text w:multiLine="1"/></w:sdtPr><w:sdtContent><w:r><w:rPr><w:rStyle w:val="PlaceholderText"/></w:rPr><w:t>[Comments]</w:t></w:r></w:sdtContent></w:sdt> -->
     <w:sdt>
       <w:sdtPr>
         <w:alias w:val="Comments"/>
@@ -116,16 +117,12 @@
         <w:placeholder>
           <w:docPart w:val="0C02FC99099648D19246354A6487E13A"/>
         </w:placeholder>
-        <w:showingPlcHdr/>
         <w:dataBinding w:prefixMappings="xmlns:ns0='http://purl.org/dc/elements/1.1/' xmlns:ns1='http://schemas.openxmlformats.org/package/2006/metadata/core-properties' " w:xpath="/ns1:coreProperties[1]/ns0:description[1]" w:storeItemID="{6C3C8BC8-F283-45AE-878A-BAB7291924A1}"/>
         <w:text w:multiLine="1"/>
       </w:sdtPr>
       <w:sdtContent>
         <w:r>
-          <w:rPr>
-            <w:rStyle w:val="PlaceholderText"/>
-          </w:rPr>
-          <w:t>[Comments]</w:t>
+          <w:t xml:space="preserve">TEMPLATE FOR THE APAQUARTO EXTENSION</w:t>
         </w:r>
       </w:sdtContent>
     </w:sdt>
@@ -1182,9 +1179,9 @@
     <w:uiPriority w:val="9"/>
     <w:unhideWhenUsed/>
     <w:qFormat/>
-    <w:rsid w:val="0017682D"/>
-    <w:pPr>
-      <w:ind w:left="720" w:right="720" w:firstLine="0"/>
+    <w:rsid w:val="0056007C"/>
+    <w:pPr>
+      <w:ind w:left="720" w:firstLine="0"/>
     </w:pPr>
   </w:style>
   <w:style w:type="paragraph" w:styleId="FootnoteText">
@@ -1193,6 +1190,10 @@
     <w:uiPriority w:val="9"/>
     <w:unhideWhenUsed/>
     <w:qFormat/>
+    <w:rsid w:val="00780A8B"/>
+    <w:pPr>
+      <w:spacing w:line="240" w:lineRule="auto"/>
+    </w:pPr>
   </w:style>
   <w:style w:type="table" w:customStyle="1" w:styleId="Table">
     <w:name w:val="Table"/>
@@ -1201,7 +1202,7 @@
     <w:qFormat/>
     <w:rsid w:val="00387689"/>
     <w:pPr>
-      <w:spacing w:before="60" w:after="60"/>
+      <w:spacing w:before="0" w:after="0"/>
     </w:pPr>
     <w:tblPr>
       <w:tblInd w:w="0" w:type="dxa"/>
@@ -1209,14 +1210,14 @@
         <w:bottom w:val="single" w:sz="4" w:space="0" w:color="auto"/>
       </w:tblBorders>
       <w:tblCellMar>
-        <w:top w:w="58" w:type="dxa"/>
+        <w:top w:w="138" w:type="dxa"/>
         <w:left w:w="58" w:type="dxa"/>
-        <w:bottom w:w="58" w:type="dxa"/>
+        <w:bottom w:w="138" w:type="dxa"/>
         <w:right w:w="58" w:type="dxa"/>
       </w:tblCellMar>
     </w:tblPr>
     <w:tcPr>
-      <w:vAlign w:val="center"/>
+      <w:vAlign w:val="top"/>
     </w:tcPr>
     <w:tblStylePr w:type="firstRow">
       <w:tblPr/>
@@ -1231,6 +1232,11 @@
           <w:tl2br w:val="nil"/>
           <w:tr2bl w:val="nil"/>
         </w:tcBorders>
+        <w:tcMar>
+          <w:top w:w="186" w:type="dxa"/>
+          <w:bottom w:w="138" w:type="dxa"/>
+        </w:tcMar>
+        <w:vAlign w:val="bottom"/>
       </w:tcPr>
     </w:tblStylePr>
   </w:style>
@@ -1258,7 +1264,7 @@
     <w:pPr>
       <w:keepNext/>
       <w:keepLines/>
-      <w:spacing w:after="120"/>
+      <w:spacing w:after="0"/>
     </w:pPr>
     <w:rPr>
       <w:i/>
@@ -1267,6 +1273,9 @@
   <w:style w:type="paragraph" w:customStyle="1" w:styleId="TableCaption">
     <w:name w:val="Table Caption"/>
     <w:basedOn w:val="Caption"/>
+    <w:pPr>
+      <w:spacing w:after="0"/>
+    </w:pPr>
   </w:style>
   <w:style w:type="paragraph" w:customStyle="1" w:styleId="ImageCaption">
     <w:name w:val="Image Caption"/>
@@ -1796,8 +1805,7 @@
     <w:pPr>
       <w:keepNext/>
       <w:keepLines/>
-      <w:spacing w:line="480" w:lineRule="auto"/>
-      <w:outlineLvl w:val="0"/>
+      <w:spacing w:before="552" w:line="480" w:lineRule="auto"/>
     </w:pPr>
     <w:rPr>
       <w:b/>
@@ -1825,7 +1833,7 @@
     <w:qFormat/>
     <w:rsid w:val="00A946AC"/>
     <w:pPr>
-      <w:spacing w:before="60"/>
+      <w:spacing w:before="260"/>
       <w:ind w:firstLine="0"/>
     </w:pPr>
   </w:style>
@@ -1864,7 +1872,7 @@
     <w:qFormat/>
     <w:rsid w:val="00C304F7"/>
     <w:pPr>
-      <w:spacing w:after="240"/>
+      <w:spacing w:after="0"/>
     </w:pPr>
   </w:style>
   <w:style w:type="character" w:customStyle="1" w:styleId="FigureWithoutNoteChar">
@@ -1893,7 +1901,7 @@
     <w:qFormat/>
     <w:rsid w:val="00BB3FEC"/>
     <w:pPr>
-      <w:spacing w:before="240"/>
+      <w:spacing w:before="552"/>
     </w:pPr>
   </w:style>
   <w:style w:type="character" w:customStyle="1" w:styleId="AfterWithoutNoteChar">
@@ -1933,7 +1941,7 @@
     <w:basedOn w:val="BodyTextChar"/>
     <w:link w:val="BlockText"/>
     <w:uiPriority w:val="9"/>
-    <w:rsid w:val="00065938"/>
+    <w:rsid w:val="0056007C"/>
   </w:style>
   <w:style w:type="character" w:customStyle="1" w:styleId="NextBlockTextChar">
     <w:name w:val="NextBlockText Char"/>
@@ -1998,6 +2006,77 @@
     <w:rPr>
       <w:szCs w:val="20"/>
     </w:rPr>
+  </w:style>
+  <w:style w:type="paragraph" w:customStyle="1" w:styleId="SubPanelNote">
+    <w:name w:val="SubPanelNote"/>
+    <w:basedOn w:val="FigureNote"/>
+    <w:link w:val="SubPanelNoteChar"/>
+    <w:qFormat/>
+    <w:rsid w:val="00BD5312"/>
+    <w:pPr>
+      <w:jc w:val="center"/>
+    </w:pPr>
+  </w:style>
+  <w:style w:type="character" w:customStyle="1" w:styleId="SubPanelNoteChar">
+    <w:name w:val="SubPanelNote Char"/>
+    <w:basedOn w:val="FigureNoteChar"/>
+    <w:link w:val="SubPanelNote"/>
+    <w:rsid w:val="00BD5312"/>
+  </w:style>
+  <w:style w:type="paragraph" w:customStyle="1" w:styleId="ApaUnlistedHeading1">
+    <w:name w:val="Apa Unlisted Heading 1"/>
+    <w:basedOn w:val="Heading1"/>
+    <w:qFormat/>
+    <w:pPr>
+      <w:outlineLvl w:val="9"/>
+    </w:pPr>
+  </w:style>
+  <w:style w:type="paragraph" w:customStyle="1" w:styleId="ApaUnlistedHeading2">
+    <w:name w:val="Apa Unlisted Heading 2"/>
+    <w:basedOn w:val="Heading2"/>
+    <w:qFormat/>
+    <w:pPr>
+      <w:outlineLvl w:val="9"/>
+    </w:pPr>
+  </w:style>
+  <w:style w:type="paragraph" w:customStyle="1" w:styleId="ApaUnlistedHeading3">
+    <w:name w:val="Apa Unlisted Heading 3"/>
+    <w:basedOn w:val="Heading3"/>
+    <w:qFormat/>
+    <w:pPr>
+      <w:outlineLvl w:val="9"/>
+    </w:pPr>
+  </w:style>
+  <w:style w:type="paragraph" w:customStyle="1" w:styleId="ApaUnlistedHeading4">
+    <w:name w:val="Apa Unlisted Heading 4"/>
+    <w:basedOn w:val="Heading4"/>
+    <w:qFormat/>
+    <w:pPr>
+      <w:outlineLvl w:val="9"/>
+    </w:pPr>
+  </w:style>
+  <w:style w:type="paragraph" w:customStyle="1" w:styleId="ApaUnlistedHeading5">
+    <w:name w:val="Apa Unlisted Heading 5"/>
+    <w:basedOn w:val="Heading5"/>
+    <w:qFormat/>
+    <w:pPr>
+      <w:outlineLvl w:val="9"/>
+    </w:pPr>
+  </w:style>
+  <w:style w:type="paragraph" w:customStyle="1" w:styleId="ApaUnlistedHeading6">
+    <w:name w:val="Apa Unlisted Heading 6"/>
+    <w:basedOn w:val="Heading6"/>
+    <w:qFormat/>
+    <w:pPr>
+      <w:outlineLvl w:val="9"/>
+    </w:pPr>
+  </w:style>
+  <w:style w:type="paragraph" w:customStyle="1" w:styleId="QuoteAttribution">
+    <w:name w:val="QuoteAttribution"/>
+    <w:basedOn w:val="BlockText"/>
+    <w:pPr>
+      <w:jc w:val="right"/>
+    </w:pPr>
   </w:style>
 </w:styles>
 </file>
@@ -2096,19 +2175,25 @@
     <w:rsid w:val="00221DB6"/>
     <w:rsid w:val="00266742"/>
     <w:rsid w:val="002E7A3C"/>
+    <w:rsid w:val="003106FC"/>
     <w:rsid w:val="003402EC"/>
     <w:rsid w:val="00440287"/>
     <w:rsid w:val="004739F0"/>
     <w:rsid w:val="004F6D10"/>
     <w:rsid w:val="005702F2"/>
     <w:rsid w:val="005B1707"/>
+    <w:rsid w:val="005C0DD9"/>
     <w:rsid w:val="0061553F"/>
+    <w:rsid w:val="006F54D0"/>
     <w:rsid w:val="007139D3"/>
     <w:rsid w:val="00843AF0"/>
+    <w:rsid w:val="0088292B"/>
+    <w:rsid w:val="00AA6B78"/>
     <w:rsid w:val="00B139B1"/>
     <w:rsid w:val="00B34FB5"/>
     <w:rsid w:val="00CE12A2"/>
     <w:rsid w:val="00D34E1D"/>
+    <w:rsid w:val="00DE61F2"/>
     <w:rsid w:val="00E37D61"/>
     <w:rsid w:val="00FC515E"/>
   </w:rsids>

</xml_diff>